<commit_message>
segundo cambio: aumento de imagenes etc etc
</commit_message>
<xml_diff>
--- a/Actividad_n_nombre_estudiante1.docx
+++ b/Actividad_n_nombre_estudiante1.docx
@@ -2988,14 +2988,12 @@
                                 <w:lang w:val="es-MX"/>
                               </w:rPr>
                             </w:pPr>
-                            <w:proofErr w:type="spellStart"/>
                             <w:r>
                               <w:rPr>
                                 <w:lang w:val="es-MX"/>
                               </w:rPr>
                               <w:t>CasoRescateController</w:t>
                             </w:r>
-                            <w:proofErr w:type="spellEnd"/>
                           </w:p>
                         </w:txbxContent>
                       </wps:txbx>
@@ -3043,14 +3041,12 @@
                           <w:lang w:val="es-MX"/>
                         </w:rPr>
                       </w:pPr>
-                      <w:proofErr w:type="spellStart"/>
                       <w:r>
                         <w:rPr>
                           <w:lang w:val="es-MX"/>
                         </w:rPr>
                         <w:t>CasoRescateController</w:t>
                       </w:r>
-                      <w:proofErr w:type="spellEnd"/>
                     </w:p>
                   </w:txbxContent>
                 </v:textbox>
@@ -3195,13 +3191,8 @@
                             <w:r>
                               <w:t xml:space="preserve"> </w:t>
                             </w:r>
-                            <w:proofErr w:type="spellStart"/>
                             <w:r>
-                              <w:t>GestorCasos</w:t>
-                            </w:r>
-                            <w:proofErr w:type="spellEnd"/>
-                            <w:r>
-                              <w:t xml:space="preserve"> - reglas                    </w:t>
+                              <w:t xml:space="preserve">GestorCasos - reglas                    </w:t>
                             </w:r>
                           </w:p>
                         </w:txbxContent>
@@ -3244,13 +3235,8 @@
                       <w:r>
                         <w:t xml:space="preserve"> </w:t>
                       </w:r>
-                      <w:proofErr w:type="spellStart"/>
                       <w:r>
-                        <w:t>GestorCasos</w:t>
-                      </w:r>
-                      <w:proofErr w:type="spellEnd"/>
-                      <w:r>
-                        <w:t xml:space="preserve"> - reglas                    </w:t>
+                        <w:t xml:space="preserve">GestorCasos - reglas                    </w:t>
                       </w:r>
                     </w:p>
                   </w:txbxContent>
@@ -3576,13 +3562,8 @@
                             <w:pPr>
                               <w:jc w:val="center"/>
                             </w:pPr>
-                            <w:proofErr w:type="spellStart"/>
                             <w:r>
-                              <w:t>AnimalFactory</w:t>
-                            </w:r>
-                            <w:proofErr w:type="spellEnd"/>
-                            <w:r>
-                              <w:t xml:space="preserve"> |</w:t>
+                              <w:t>AnimalFactory |</w:t>
                             </w:r>
                           </w:p>
                           <w:p>
@@ -3598,13 +3579,8 @@
                               <w:jc w:val="center"/>
                             </w:pPr>
                             <w:r>
-                              <w:t xml:space="preserve">  | </w:t>
+                              <w:t xml:space="preserve">  | FaunaSilvestre</w:t>
                             </w:r>
-                            <w:proofErr w:type="spellStart"/>
-                            <w:r>
-                              <w:t>FaunaSilvestre</w:t>
-                            </w:r>
-                            <w:proofErr w:type="spellEnd"/>
                           </w:p>
                           <w:p>
                             <w:pPr>
@@ -3637,13 +3613,8 @@
                       <w:pPr>
                         <w:jc w:val="center"/>
                       </w:pPr>
-                      <w:proofErr w:type="spellStart"/>
                       <w:r>
-                        <w:t>AnimalFactory</w:t>
-                      </w:r>
-                      <w:proofErr w:type="spellEnd"/>
-                      <w:r>
-                        <w:t xml:space="preserve"> |</w:t>
+                        <w:t>AnimalFactory |</w:t>
                       </w:r>
                     </w:p>
                     <w:p>
@@ -3659,13 +3630,8 @@
                         <w:jc w:val="center"/>
                       </w:pPr>
                       <w:r>
-                        <w:t xml:space="preserve">  | </w:t>
+                        <w:t xml:space="preserve">  | FaunaSilvestre</w:t>
                       </w:r>
-                      <w:proofErr w:type="spellStart"/>
-                      <w:r>
-                        <w:t>FaunaSilvestre</w:t>
-                      </w:r>
-                      <w:proofErr w:type="spellEnd"/>
                     </w:p>
                     <w:p>
                       <w:pPr>
@@ -3909,10 +3875,7 @@
     </w:p>
     <w:p>
       <w:r>
-        <w:t xml:space="preserve">    T[Veterinario</w:t>
-      </w:r>
-      <w:r>
-        <w:t>]</w:t>
+        <w:t xml:space="preserve">    T[Veterinario]</w:t>
       </w:r>
     </w:p>
     <w:p>
@@ -4000,19 +3963,13 @@
       </w:r>
       <w:proofErr w:type="spellStart"/>
       <w:r>
-        <w:t>E</w:t>
-      </w:r>
-      <w:r>
-        <w:t>nd</w:t>
-      </w:r>
-      <w:proofErr w:type="spellEnd"/>
-    </w:p>
-    <w:p>
-      <w:r>
-        <w:t xml:space="preserve">    C --&gt; U</w:t>
-      </w:r>
-      <w:r>
-        <w:t>1</w:t>
+        <w:t>End</w:t>
+      </w:r>
+      <w:proofErr w:type="spellEnd"/>
+    </w:p>
+    <w:p>
+      <w:r>
+        <w:t xml:space="preserve">    C --&gt; U1</w:t>
       </w:r>
     </w:p>
     <w:p>
@@ -7583,31 +7540,161 @@
           <w:rFonts w:ascii="Arial" w:hAnsi="Arial" w:cs="Arial"/>
           <w:b/>
           <w:bCs/>
+          <w:i/>
+          <w:iCs/>
+          <w:sz w:val="20"/>
+          <w:szCs w:val="20"/>
+          <w:lang w:eastAsia="es-EC"/>
+        </w:rPr>
+        <w:t xml:space="preserve">Ejecución </w:t>
+      </w:r>
+    </w:p>
+    <w:p>
+      <w:pPr>
+        <w:widowControl w:val="0"/>
+        <w:pBdr>
+          <w:top w:val="nil"/>
+          <w:left w:val="nil"/>
+          <w:bottom w:val="nil"/>
+          <w:right w:val="nil"/>
+          <w:between w:val="nil"/>
+        </w:pBdr>
+        <w:spacing w:after="0" w:line="240" w:lineRule="auto"/>
+        <w:jc w:val="both"/>
+        <w:rPr>
+          <w:rFonts w:ascii="Arial" w:hAnsi="Arial" w:cs="Arial"/>
+          <w:b/>
+          <w:bCs/>
+          <w:i/>
+          <w:iCs/>
+          <w:sz w:val="20"/>
+          <w:szCs w:val="20"/>
+          <w:lang w:eastAsia="es-EC"/>
+        </w:rPr>
+      </w:pPr>
+    </w:p>
+    <w:p>
+      <w:pPr>
+        <w:widowControl w:val="0"/>
+        <w:pBdr>
+          <w:top w:val="nil"/>
+          <w:left w:val="nil"/>
+          <w:bottom w:val="nil"/>
+          <w:right w:val="nil"/>
+          <w:between w:val="nil"/>
+        </w:pBdr>
+        <w:spacing w:after="0" w:line="240" w:lineRule="auto"/>
+        <w:jc w:val="both"/>
+        <w:rPr>
+          <w:rFonts w:ascii="Arial" w:hAnsi="Arial" w:cs="Arial"/>
+          <w:b/>
+          <w:bCs/>
+          <w:i/>
+          <w:iCs/>
+          <w:sz w:val="20"/>
+          <w:szCs w:val="20"/>
+          <w:lang w:eastAsia="es-EC"/>
+        </w:rPr>
+      </w:pPr>
+    </w:p>
+    <w:p>
+      <w:pPr>
+        <w:widowControl w:val="0"/>
+        <w:pBdr>
+          <w:top w:val="nil"/>
+          <w:left w:val="nil"/>
+          <w:bottom w:val="nil"/>
+          <w:right w:val="nil"/>
+          <w:between w:val="nil"/>
+        </w:pBdr>
+        <w:spacing w:after="0" w:line="240" w:lineRule="auto"/>
+        <w:jc w:val="both"/>
+        <w:rPr>
+          <w:rFonts w:ascii="Arial" w:hAnsi="Arial" w:cs="Arial"/>
+          <w:b/>
+          <w:bCs/>
+          <w:i/>
+          <w:iCs/>
+          <w:sz w:val="20"/>
+          <w:szCs w:val="20"/>
+          <w:lang w:eastAsia="es-EC"/>
+        </w:rPr>
+      </w:pPr>
+      <w:hyperlink r:id="rId14" w:history="1">
+        <w:r>
+          <w:rPr>
+            <w:rStyle w:val="Hipervnculo"/>
+            <w:rFonts w:ascii="Arial" w:hAnsi="Arial" w:cs="Arial"/>
+            <w:b/>
+            <w:bCs/>
+            <w:i/>
+            <w:iCs/>
+            <w:sz w:val="20"/>
+            <w:szCs w:val="20"/>
+            <w:lang w:eastAsia="es-EC"/>
+          </w:rPr>
+          <w:t>https://github.com/jmancilla5015-ctrl/tarea-1estudio-de-casos-.git</w:t>
+        </w:r>
+      </w:hyperlink>
+      <w:r>
+        <w:rPr>
+          <w:rFonts w:ascii="Arial" w:hAnsi="Arial" w:cs="Arial"/>
+          <w:b/>
+          <w:bCs/>
+          <w:i/>
+          <w:iCs/>
+          <w:sz w:val="20"/>
+          <w:szCs w:val="20"/>
+          <w:lang w:eastAsia="es-EC"/>
+        </w:rPr>
+        <w:t xml:space="preserve"> </w:t>
+      </w:r>
+    </w:p>
+    <w:p>
+      <w:pPr>
+        <w:widowControl w:val="0"/>
+        <w:pBdr>
+          <w:top w:val="nil"/>
+          <w:left w:val="nil"/>
+          <w:bottom w:val="nil"/>
+          <w:right w:val="nil"/>
+          <w:between w:val="nil"/>
+        </w:pBdr>
+        <w:spacing w:after="0" w:line="240" w:lineRule="auto"/>
+        <w:jc w:val="both"/>
+        <w:rPr>
+          <w:rFonts w:ascii="Arial" w:hAnsi="Arial" w:cs="Arial"/>
+          <w:b/>
+          <w:bCs/>
+          <w:i/>
+          <w:iCs/>
+          <w:sz w:val="20"/>
+          <w:szCs w:val="20"/>
+          <w:lang w:eastAsia="es-EC"/>
+        </w:rPr>
+      </w:pPr>
+      <w:r>
+        <w:rPr>
+          <w:rFonts w:ascii="Arial" w:hAnsi="Arial" w:cs="Arial"/>
+          <w:b/>
+          <w:bCs/>
           <w:noProof/>
           <w:sz w:val="24"/>
           <w:szCs w:val="24"/>
           <w:lang w:eastAsia="es-EC"/>
         </w:rPr>
         <w:drawing>
-          <wp:anchor distT="0" distB="0" distL="114300" distR="114300" simplePos="0" relativeHeight="251680768" behindDoc="1" locked="0" layoutInCell="1" allowOverlap="1" wp14:anchorId="4B91057E" wp14:editId="31687D98">
+          <wp:anchor distT="0" distB="0" distL="114300" distR="114300" simplePos="0" relativeHeight="251680768" behindDoc="0" locked="0" layoutInCell="1" allowOverlap="1" wp14:anchorId="4B91057E" wp14:editId="1341D802">
             <wp:simplePos x="0" y="0"/>
             <wp:positionH relativeFrom="margin">
-              <wp:posOffset>-394970</wp:posOffset>
+              <wp:posOffset>-537210</wp:posOffset>
             </wp:positionH>
             <wp:positionV relativeFrom="paragraph">
-              <wp:posOffset>153670</wp:posOffset>
+              <wp:posOffset>140970</wp:posOffset>
             </wp:positionV>
-            <wp:extent cx="2886075" cy="1216660"/>
-            <wp:effectExtent l="0" t="0" r="9525" b="2540"/>
-            <wp:wrapTight wrapText="bothSides">
-              <wp:wrapPolygon edited="0">
-                <wp:start x="0" y="0"/>
-                <wp:lineTo x="0" y="21307"/>
-                <wp:lineTo x="21529" y="21307"/>
-                <wp:lineTo x="21529" y="0"/>
-                <wp:lineTo x="0" y="0"/>
-              </wp:wrapPolygon>
-            </wp:wrapTight>
+            <wp:extent cx="2886075" cy="1104900"/>
+            <wp:effectExtent l="0" t="0" r="9525" b="0"/>
+            <wp:wrapNone/>
             <wp:docPr id="12" name="Imagen 12"/>
             <wp:cNvGraphicFramePr>
               <a:graphicFrameLocks xmlns:a="http://schemas.openxmlformats.org/drawingml/2006/main" noChangeAspect="1"/>
@@ -7622,7 +7709,7 @@
                     </pic:cNvPicPr>
                   </pic:nvPicPr>
                   <pic:blipFill>
-                    <a:blip r:embed="rId14" cstate="print">
+                    <a:blip r:embed="rId15" cstate="print">
                       <a:extLst>
                         <a:ext uri="{28A0092B-C50C-407E-A947-70E740481C1C}">
                           <a14:useLocalDpi xmlns:a14="http://schemas.microsoft.com/office/drawing/2010/main" val="0"/>
@@ -7637,7 +7724,7 @@
                   <pic:spPr bwMode="auto">
                     <a:xfrm>
                       <a:off x="0" y="0"/>
-                      <a:ext cx="2886075" cy="1216660"/>
+                      <a:ext cx="2886075" cy="1104900"/>
                     </a:xfrm>
                     <a:prstGeom prst="rect">
                       <a:avLst/>
@@ -7659,19 +7746,6 @@
           </wp:anchor>
         </w:drawing>
       </w:r>
-      <w:r>
-        <w:rPr>
-          <w:rFonts w:ascii="Arial" w:hAnsi="Arial" w:cs="Arial"/>
-          <w:b/>
-          <w:bCs/>
-          <w:i/>
-          <w:iCs/>
-          <w:sz w:val="20"/>
-          <w:szCs w:val="20"/>
-          <w:lang w:eastAsia="es-EC"/>
-        </w:rPr>
-        <w:t xml:space="preserve">Ejecución </w:t>
-      </w:r>
     </w:p>
     <w:p>
       <w:pPr>
@@ -7686,12 +7760,13 @@
         <w:spacing w:after="0" w:line="240" w:lineRule="auto"/>
         <w:jc w:val="both"/>
         <w:rPr>
-          <w:rFonts w:ascii="Arial" w:eastAsiaTheme="majorEastAsia" w:hAnsi="Arial" w:cs="Arial"/>
+          <w:rFonts w:ascii="Arial" w:hAnsi="Arial" w:cs="Arial"/>
           <w:b/>
           <w:bCs/>
-          <w:color w:val="2F5496" w:themeColor="accent1" w:themeShade="BF"/>
-          <w:sz w:val="24"/>
-          <w:szCs w:val="24"/>
+          <w:i/>
+          <w:iCs/>
+          <w:sz w:val="20"/>
+          <w:szCs w:val="20"/>
           <w:lang w:eastAsia="es-EC"/>
         </w:rPr>
       </w:pPr>
@@ -7706,16 +7781,16 @@
           <w:lang w:eastAsia="es-EC"/>
         </w:rPr>
         <w:drawing>
-          <wp:anchor distT="0" distB="0" distL="114300" distR="114300" simplePos="0" relativeHeight="251681792" behindDoc="0" locked="0" layoutInCell="1" allowOverlap="1" wp14:anchorId="3C360184" wp14:editId="5865C67C">
+          <wp:anchor distT="0" distB="0" distL="114300" distR="114300" simplePos="0" relativeHeight="251681792" behindDoc="0" locked="0" layoutInCell="1" allowOverlap="1" wp14:anchorId="3C360184" wp14:editId="5E213590">
             <wp:simplePos x="0" y="0"/>
             <wp:positionH relativeFrom="margin">
-              <wp:align>right</wp:align>
+              <wp:posOffset>2815590</wp:posOffset>
             </wp:positionH>
             <wp:positionV relativeFrom="paragraph">
-              <wp:posOffset>26670</wp:posOffset>
+              <wp:posOffset>90170</wp:posOffset>
             </wp:positionV>
-            <wp:extent cx="2743200" cy="1228725"/>
-            <wp:effectExtent l="0" t="0" r="0" b="9525"/>
+            <wp:extent cx="2743200" cy="1066800"/>
+            <wp:effectExtent l="0" t="0" r="0" b="0"/>
             <wp:wrapNone/>
             <wp:docPr id="13" name="Imagen 13"/>
             <wp:cNvGraphicFramePr>
@@ -7731,7 +7806,7 @@
                     </pic:cNvPicPr>
                   </pic:nvPicPr>
                   <pic:blipFill rotWithShape="1">
-                    <a:blip r:embed="rId15" cstate="print">
+                    <a:blip r:embed="rId16" cstate="print">
                       <a:extLst>
                         <a:ext uri="{28A0092B-C50C-407E-A947-70E740481C1C}">
                           <a14:useLocalDpi xmlns:a14="http://schemas.microsoft.com/office/drawing/2010/main" val="0"/>
@@ -7744,7 +7819,7 @@
                   <pic:spPr bwMode="auto">
                     <a:xfrm>
                       <a:off x="0" y="0"/>
-                      <a:ext cx="2743200" cy="1228725"/>
+                      <a:ext cx="2743200" cy="1066800"/>
                     </a:xfrm>
                     <a:prstGeom prst="rect">
                       <a:avLst/>
@@ -7771,17 +7846,149 @@
           </wp:anchor>
         </w:drawing>
       </w:r>
-      <w:r>
+    </w:p>
+    <w:p>
+      <w:pPr>
+        <w:widowControl w:val="0"/>
+        <w:pBdr>
+          <w:top w:val="nil"/>
+          <w:left w:val="nil"/>
+          <w:bottom w:val="nil"/>
+          <w:right w:val="nil"/>
+          <w:between w:val="nil"/>
+        </w:pBdr>
+        <w:spacing w:after="0" w:line="240" w:lineRule="auto"/>
+        <w:jc w:val="both"/>
         <w:rPr>
           <w:rFonts w:ascii="Arial" w:hAnsi="Arial" w:cs="Arial"/>
           <w:b/>
           <w:bCs/>
+          <w:i/>
+          <w:iCs/>
+          <w:sz w:val="20"/>
+          <w:szCs w:val="20"/>
+          <w:lang w:eastAsia="es-EC"/>
+        </w:rPr>
+      </w:pPr>
+    </w:p>
+    <w:p>
+      <w:pPr>
+        <w:widowControl w:val="0"/>
+        <w:pBdr>
+          <w:top w:val="nil"/>
+          <w:left w:val="nil"/>
+          <w:bottom w:val="nil"/>
+          <w:right w:val="nil"/>
+          <w:between w:val="nil"/>
+        </w:pBdr>
+        <w:spacing w:after="0" w:line="240" w:lineRule="auto"/>
+        <w:jc w:val="both"/>
+        <w:rPr>
+          <w:rFonts w:ascii="Arial" w:hAnsi="Arial" w:cs="Arial"/>
+          <w:b/>
+          <w:bCs/>
+          <w:i/>
+          <w:iCs/>
+          <w:sz w:val="20"/>
+          <w:szCs w:val="20"/>
+          <w:lang w:eastAsia="es-EC"/>
+        </w:rPr>
+      </w:pPr>
+    </w:p>
+    <w:p>
+      <w:pPr>
+        <w:widowControl w:val="0"/>
+        <w:pBdr>
+          <w:top w:val="nil"/>
+          <w:left w:val="nil"/>
+          <w:bottom w:val="nil"/>
+          <w:right w:val="nil"/>
+          <w:between w:val="nil"/>
+        </w:pBdr>
+        <w:spacing w:after="0" w:line="240" w:lineRule="auto"/>
+        <w:jc w:val="both"/>
+        <w:rPr>
+          <w:rFonts w:ascii="Arial" w:hAnsi="Arial" w:cs="Arial"/>
+          <w:b/>
+          <w:bCs/>
+          <w:i/>
+          <w:iCs/>
+          <w:sz w:val="20"/>
+          <w:szCs w:val="20"/>
+          <w:lang w:eastAsia="es-EC"/>
+        </w:rPr>
+      </w:pPr>
+    </w:p>
+    <w:p>
+      <w:pPr>
+        <w:widowControl w:val="0"/>
+        <w:pBdr>
+          <w:top w:val="nil"/>
+          <w:left w:val="nil"/>
+          <w:bottom w:val="nil"/>
+          <w:right w:val="nil"/>
+          <w:between w:val="nil"/>
+        </w:pBdr>
+        <w:spacing w:after="0" w:line="240" w:lineRule="auto"/>
+        <w:jc w:val="both"/>
+        <w:rPr>
+          <w:rFonts w:ascii="Arial" w:hAnsi="Arial" w:cs="Arial"/>
+          <w:b/>
+          <w:bCs/>
+          <w:i/>
+          <w:iCs/>
+          <w:sz w:val="20"/>
+          <w:szCs w:val="20"/>
+          <w:lang w:eastAsia="es-EC"/>
+        </w:rPr>
+      </w:pPr>
+    </w:p>
+    <w:p>
+      <w:pPr>
+        <w:widowControl w:val="0"/>
+        <w:pBdr>
+          <w:top w:val="nil"/>
+          <w:left w:val="nil"/>
+          <w:bottom w:val="nil"/>
+          <w:right w:val="nil"/>
+          <w:between w:val="nil"/>
+        </w:pBdr>
+        <w:spacing w:after="0" w:line="240" w:lineRule="auto"/>
+        <w:jc w:val="both"/>
+        <w:rPr>
+          <w:rFonts w:ascii="Arial" w:hAnsi="Arial" w:cs="Arial"/>
+          <w:b/>
+          <w:bCs/>
+          <w:i/>
+          <w:iCs/>
+          <w:sz w:val="20"/>
+          <w:szCs w:val="20"/>
+          <w:lang w:eastAsia="es-EC"/>
+        </w:rPr>
+      </w:pPr>
+    </w:p>
+    <w:p>
+      <w:pPr>
+        <w:widowControl w:val="0"/>
+        <w:pBdr>
+          <w:top w:val="nil"/>
+          <w:left w:val="nil"/>
+          <w:bottom w:val="nil"/>
+          <w:right w:val="nil"/>
+          <w:between w:val="nil"/>
+        </w:pBdr>
+        <w:spacing w:after="0" w:line="240" w:lineRule="auto"/>
+        <w:jc w:val="both"/>
+        <w:rPr>
+          <w:rFonts w:ascii="Arial" w:eastAsiaTheme="majorEastAsia" w:hAnsi="Arial" w:cs="Arial"/>
+          <w:b/>
+          <w:bCs/>
+          <w:color w:val="2F5496" w:themeColor="accent1" w:themeShade="BF"/>
           <w:sz w:val="24"/>
           <w:szCs w:val="24"/>
           <w:lang w:eastAsia="es-EC"/>
         </w:rPr>
-        <w:br w:type="page"/>
-      </w:r>
+      </w:pPr>
     </w:p>
     <w:p>
       <w:pPr>
@@ -7803,28 +8010,27 @@
           <w:noProof/>
           <w:lang w:eastAsia="es-EC"/>
         </w:rPr>
-        <w:lastRenderedPageBreak/>
         <w:drawing>
-          <wp:anchor distT="0" distB="0" distL="114300" distR="114300" simplePos="0" relativeHeight="251697152" behindDoc="1" locked="0" layoutInCell="1" allowOverlap="1" wp14:anchorId="06D0CB13" wp14:editId="3BDCA70C">
+          <wp:anchor distT="0" distB="0" distL="114300" distR="114300" simplePos="0" relativeHeight="251682816" behindDoc="1" locked="0" layoutInCell="1" allowOverlap="1" wp14:anchorId="4F956ADD" wp14:editId="38BCABCB">
             <wp:simplePos x="0" y="0"/>
-            <wp:positionH relativeFrom="column">
-              <wp:posOffset>3949065</wp:posOffset>
+            <wp:positionH relativeFrom="margin">
+              <wp:posOffset>-727710</wp:posOffset>
             </wp:positionH>
             <wp:positionV relativeFrom="paragraph">
-              <wp:posOffset>5330825</wp:posOffset>
+              <wp:posOffset>173990</wp:posOffset>
             </wp:positionV>
-            <wp:extent cx="2447925" cy="1581150"/>
+            <wp:extent cx="2162175" cy="1143000"/>
             <wp:effectExtent l="0" t="0" r="9525" b="0"/>
             <wp:wrapTight wrapText="bothSides">
               <wp:wrapPolygon edited="0">
                 <wp:start x="0" y="0"/>
-                <wp:lineTo x="0" y="21340"/>
-                <wp:lineTo x="21516" y="21340"/>
-                <wp:lineTo x="21516" y="0"/>
+                <wp:lineTo x="0" y="21240"/>
+                <wp:lineTo x="21505" y="21240"/>
+                <wp:lineTo x="21505" y="0"/>
                 <wp:lineTo x="0" y="0"/>
               </wp:wrapPolygon>
             </wp:wrapTight>
-            <wp:docPr id="34" name="Imagen 34"/>
+            <wp:docPr id="20" name="Imagen 20"/>
             <wp:cNvGraphicFramePr>
               <a:graphicFrameLocks xmlns:a="http://schemas.openxmlformats.org/drawingml/2006/main" noChangeAspect="1"/>
             </wp:cNvGraphicFramePr>
@@ -7832,26 +8038,26 @@
               <a:graphicData uri="http://schemas.openxmlformats.org/drawingml/2006/picture">
                 <pic:pic xmlns:pic="http://schemas.openxmlformats.org/drawingml/2006/picture">
                   <pic:nvPicPr>
-                    <pic:cNvPr id="0" name="Picture 18"/>
+                    <pic:cNvPr id="0" name="Picture 4"/>
                     <pic:cNvPicPr>
                       <a:picLocks noChangeAspect="1" noChangeArrowheads="1"/>
                     </pic:cNvPicPr>
                   </pic:nvPicPr>
                   <pic:blipFill rotWithShape="1">
-                    <a:blip r:embed="rId16">
+                    <a:blip r:embed="rId17" cstate="print">
                       <a:extLst>
                         <a:ext uri="{28A0092B-C50C-407E-A947-70E740481C1C}">
                           <a14:useLocalDpi xmlns:a14="http://schemas.microsoft.com/office/drawing/2010/main" val="0"/>
                         </a:ext>
                       </a:extLst>
                     </a:blip>
-                    <a:srcRect r="10396" b="43269"/>
+                    <a:srcRect l="14111" t="16326" r="11629" b="16668"/>
                     <a:stretch/>
                   </pic:blipFill>
                   <pic:spPr bwMode="auto">
                     <a:xfrm>
                       <a:off x="0" y="0"/>
-                      <a:ext cx="2447925" cy="1581150"/>
+                      <a:ext cx="2162175" cy="1143000"/>
                     </a:xfrm>
                     <a:prstGeom prst="rect">
                       <a:avLst/>
@@ -7887,26 +8093,26 @@
           <w:lang w:eastAsia="es-EC"/>
         </w:rPr>
         <w:drawing>
-          <wp:anchor distT="0" distB="0" distL="114300" distR="114300" simplePos="0" relativeHeight="251695104" behindDoc="1" locked="0" layoutInCell="1" allowOverlap="1" wp14:anchorId="3356FB66" wp14:editId="337DCC2C">
+          <wp:anchor distT="0" distB="0" distL="114300" distR="114300" simplePos="0" relativeHeight="251684864" behindDoc="1" locked="0" layoutInCell="1" allowOverlap="1" wp14:anchorId="5B1E9AD8" wp14:editId="4CD06039">
             <wp:simplePos x="0" y="0"/>
             <wp:positionH relativeFrom="column">
               <wp:posOffset>4034790</wp:posOffset>
             </wp:positionH>
             <wp:positionV relativeFrom="paragraph">
-              <wp:posOffset>3949700</wp:posOffset>
+              <wp:posOffset>164465</wp:posOffset>
             </wp:positionV>
-            <wp:extent cx="2305050" cy="1276350"/>
+            <wp:extent cx="2057400" cy="1143000"/>
             <wp:effectExtent l="0" t="0" r="0" b="0"/>
             <wp:wrapTight wrapText="bothSides">
               <wp:wrapPolygon edited="0">
                 <wp:start x="0" y="0"/>
-                <wp:lineTo x="0" y="21278"/>
-                <wp:lineTo x="21421" y="21278"/>
-                <wp:lineTo x="21421" y="0"/>
+                <wp:lineTo x="0" y="21240"/>
+                <wp:lineTo x="21400" y="21240"/>
+                <wp:lineTo x="21400" y="0"/>
                 <wp:lineTo x="0" y="0"/>
               </wp:wrapPolygon>
             </wp:wrapTight>
-            <wp:docPr id="32" name="Imagen 32"/>
+            <wp:docPr id="22" name="Imagen 22"/>
             <wp:cNvGraphicFramePr>
               <a:graphicFrameLocks xmlns:a="http://schemas.openxmlformats.org/drawingml/2006/main" noChangeAspect="1"/>
             </wp:cNvGraphicFramePr>
@@ -7914,26 +8120,26 @@
               <a:graphicData uri="http://schemas.openxmlformats.org/drawingml/2006/picture">
                 <pic:pic xmlns:pic="http://schemas.openxmlformats.org/drawingml/2006/picture">
                   <pic:nvPicPr>
-                    <pic:cNvPr id="0" name="Picture 16"/>
+                    <pic:cNvPr id="0" name="Picture 6"/>
                     <pic:cNvPicPr>
                       <a:picLocks noChangeAspect="1" noChangeArrowheads="1"/>
                     </pic:cNvPicPr>
                   </pic:nvPicPr>
                   <pic:blipFill rotWithShape="1">
-                    <a:blip r:embed="rId17">
+                    <a:blip r:embed="rId18">
                       <a:extLst>
                         <a:ext uri="{28A0092B-C50C-407E-A947-70E740481C1C}">
                           <a14:useLocalDpi xmlns:a14="http://schemas.microsoft.com/office/drawing/2010/main" val="0"/>
                         </a:ext>
                       </a:extLst>
                     </a:blip>
-                    <a:srcRect r="62606" b="70630"/>
+                    <a:srcRect l="24694" t="8501" b="31699"/>
                     <a:stretch/>
                   </pic:blipFill>
                   <pic:spPr bwMode="auto">
                     <a:xfrm>
                       <a:off x="0" y="0"/>
-                      <a:ext cx="2305050" cy="1276350"/>
+                      <a:ext cx="2057400" cy="1143000"/>
                     </a:xfrm>
                     <a:prstGeom prst="rect">
                       <a:avLst/>
@@ -7969,104 +8175,22 @@
           <w:lang w:eastAsia="es-EC"/>
         </w:rPr>
         <w:drawing>
-          <wp:anchor distT="0" distB="0" distL="114300" distR="114300" simplePos="0" relativeHeight="251691008" behindDoc="1" locked="0" layoutInCell="1" allowOverlap="1" wp14:anchorId="788332DC" wp14:editId="65B0EE59">
-            <wp:simplePos x="0" y="0"/>
-            <wp:positionH relativeFrom="column">
-              <wp:posOffset>4110990</wp:posOffset>
-            </wp:positionH>
-            <wp:positionV relativeFrom="paragraph">
-              <wp:posOffset>2730500</wp:posOffset>
-            </wp:positionV>
-            <wp:extent cx="2238375" cy="1190625"/>
-            <wp:effectExtent l="0" t="0" r="9525" b="9525"/>
-            <wp:wrapTight wrapText="bothSides">
-              <wp:wrapPolygon edited="0">
-                <wp:start x="0" y="0"/>
-                <wp:lineTo x="0" y="21427"/>
-                <wp:lineTo x="21508" y="21427"/>
-                <wp:lineTo x="21508" y="0"/>
-                <wp:lineTo x="0" y="0"/>
-              </wp:wrapPolygon>
-            </wp:wrapTight>
-            <wp:docPr id="28" name="Imagen 28"/>
-            <wp:cNvGraphicFramePr>
-              <a:graphicFrameLocks xmlns:a="http://schemas.openxmlformats.org/drawingml/2006/main" noChangeAspect="1"/>
-            </wp:cNvGraphicFramePr>
-            <a:graphic xmlns:a="http://schemas.openxmlformats.org/drawingml/2006/main">
-              <a:graphicData uri="http://schemas.openxmlformats.org/drawingml/2006/picture">
-                <pic:pic xmlns:pic="http://schemas.openxmlformats.org/drawingml/2006/picture">
-                  <pic:nvPicPr>
-                    <pic:cNvPr id="0" name="Picture 12"/>
-                    <pic:cNvPicPr>
-                      <a:picLocks noChangeAspect="1" noChangeArrowheads="1"/>
-                    </pic:cNvPicPr>
-                  </pic:nvPicPr>
-                  <pic:blipFill rotWithShape="1">
-                    <a:blip r:embed="rId18" cstate="print">
-                      <a:extLst>
-                        <a:ext uri="{28A0092B-C50C-407E-A947-70E740481C1C}">
-                          <a14:useLocalDpi xmlns:a14="http://schemas.microsoft.com/office/drawing/2010/main" val="0"/>
-                        </a:ext>
-                      </a:extLst>
-                    </a:blip>
-                    <a:srcRect l="26859" t="11558" r="27376" b="24229"/>
-                    <a:stretch/>
-                  </pic:blipFill>
-                  <pic:spPr bwMode="auto">
-                    <a:xfrm>
-                      <a:off x="0" y="0"/>
-                      <a:ext cx="2238375" cy="1190625"/>
-                    </a:xfrm>
-                    <a:prstGeom prst="rect">
-                      <a:avLst/>
-                    </a:prstGeom>
-                    <a:noFill/>
-                    <a:ln>
-                      <a:noFill/>
-                    </a:ln>
-                    <a:extLst>
-                      <a:ext uri="{53640926-AAD7-44D8-BBD7-CCE9431645EC}">
-                        <a14:shadowObscured xmlns:a14="http://schemas.microsoft.com/office/drawing/2010/main"/>
-                      </a:ext>
-                    </a:extLst>
-                  </pic:spPr>
-                </pic:pic>
-              </a:graphicData>
-            </a:graphic>
-            <wp14:sizeRelH relativeFrom="margin">
-              <wp14:pctWidth>0</wp14:pctWidth>
-            </wp14:sizeRelH>
-            <wp14:sizeRelV relativeFrom="margin">
-              <wp14:pctHeight>0</wp14:pctHeight>
-            </wp14:sizeRelV>
-          </wp:anchor>
-        </w:drawing>
-      </w:r>
-      <w:r>
-        <w:rPr>
-          <w:rFonts w:ascii="Arial" w:hAnsi="Arial" w:cs="Arial"/>
-          <w:b/>
-          <w:bCs/>
-          <w:noProof/>
-          <w:lang w:eastAsia="es-EC"/>
-        </w:rPr>
-        <w:drawing>
-          <wp:anchor distT="0" distB="0" distL="114300" distR="114300" simplePos="0" relativeHeight="251687936" behindDoc="1" locked="0" layoutInCell="1" allowOverlap="1" wp14:anchorId="50E84585" wp14:editId="788A2810">
+          <wp:anchor distT="0" distB="0" distL="114300" distR="114300" simplePos="0" relativeHeight="251687936" behindDoc="1" locked="0" layoutInCell="1" allowOverlap="1" wp14:anchorId="50E84585" wp14:editId="52520067">
             <wp:simplePos x="0" y="0"/>
             <wp:positionH relativeFrom="column">
               <wp:posOffset>4120515</wp:posOffset>
             </wp:positionH>
             <wp:positionV relativeFrom="paragraph">
-              <wp:posOffset>1492250</wp:posOffset>
+              <wp:posOffset>1488440</wp:posOffset>
             </wp:positionV>
-            <wp:extent cx="2190750" cy="1133475"/>
+            <wp:extent cx="1943100" cy="1133475"/>
             <wp:effectExtent l="0" t="0" r="0" b="9525"/>
             <wp:wrapTight wrapText="bothSides">
               <wp:wrapPolygon edited="0">
                 <wp:start x="0" y="0"/>
                 <wp:lineTo x="0" y="21418"/>
-                <wp:lineTo x="21412" y="21418"/>
-                <wp:lineTo x="21412" y="0"/>
+                <wp:lineTo x="21388" y="21418"/>
+                <wp:lineTo x="21388" y="0"/>
                 <wp:lineTo x="0" y="0"/>
               </wp:wrapPolygon>
             </wp:wrapTight>
@@ -8097,7 +8221,7 @@
                   <pic:spPr bwMode="auto">
                     <a:xfrm>
                       <a:off x="0" y="0"/>
-                      <a:ext cx="2190750" cy="1133475"/>
+                      <a:ext cx="1943100" cy="1133475"/>
                     </a:xfrm>
                     <a:prstGeom prst="rect">
                       <a:avLst/>
@@ -8133,26 +8257,26 @@
           <w:lang w:eastAsia="es-EC"/>
         </w:rPr>
         <w:drawing>
-          <wp:anchor distT="0" distB="0" distL="114300" distR="114300" simplePos="0" relativeHeight="251684864" behindDoc="1" locked="0" layoutInCell="1" allowOverlap="1" wp14:anchorId="5B1E9AD8" wp14:editId="44BC9141">
+          <wp:anchor distT="0" distB="0" distL="114300" distR="114300" simplePos="0" relativeHeight="251685888" behindDoc="1" locked="0" layoutInCell="1" allowOverlap="1" wp14:anchorId="318E382B" wp14:editId="4B7927CF">
             <wp:simplePos x="0" y="0"/>
-            <wp:positionH relativeFrom="column">
-              <wp:posOffset>4034790</wp:posOffset>
+            <wp:positionH relativeFrom="margin">
+              <wp:posOffset>-775335</wp:posOffset>
             </wp:positionH>
             <wp:positionV relativeFrom="paragraph">
-              <wp:posOffset>168275</wp:posOffset>
+              <wp:posOffset>1450340</wp:posOffset>
             </wp:positionV>
-            <wp:extent cx="2304415" cy="1143000"/>
-            <wp:effectExtent l="0" t="0" r="635" b="0"/>
+            <wp:extent cx="2266950" cy="1238250"/>
+            <wp:effectExtent l="0" t="0" r="0" b="0"/>
             <wp:wrapTight wrapText="bothSides">
               <wp:wrapPolygon edited="0">
                 <wp:start x="0" y="0"/>
-                <wp:lineTo x="0" y="21240"/>
-                <wp:lineTo x="21427" y="21240"/>
-                <wp:lineTo x="21427" y="0"/>
+                <wp:lineTo x="0" y="21268"/>
+                <wp:lineTo x="21418" y="21268"/>
+                <wp:lineTo x="21418" y="0"/>
                 <wp:lineTo x="0" y="0"/>
               </wp:wrapPolygon>
             </wp:wrapTight>
-            <wp:docPr id="22" name="Imagen 22"/>
+            <wp:docPr id="23" name="Imagen 23"/>
             <wp:cNvGraphicFramePr>
               <a:graphicFrameLocks xmlns:a="http://schemas.openxmlformats.org/drawingml/2006/main" noChangeAspect="1"/>
             </wp:cNvGraphicFramePr>
@@ -8160,26 +8284,105 @@
               <a:graphicData uri="http://schemas.openxmlformats.org/drawingml/2006/picture">
                 <pic:pic xmlns:pic="http://schemas.openxmlformats.org/drawingml/2006/picture">
                   <pic:nvPicPr>
-                    <pic:cNvPr id="0" name="Picture 6"/>
+                    <pic:cNvPr id="0" name="Picture 7"/>
                     <pic:cNvPicPr>
                       <a:picLocks noChangeAspect="1" noChangeArrowheads="1"/>
                     </pic:cNvPicPr>
                   </pic:nvPicPr>
-                  <pic:blipFill rotWithShape="1">
-                    <a:blip r:embed="rId20">
+                  <pic:blipFill>
+                    <a:blip r:embed="rId20" cstate="print">
                       <a:extLst>
                         <a:ext uri="{28A0092B-C50C-407E-A947-70E740481C1C}">
                           <a14:useLocalDpi xmlns:a14="http://schemas.microsoft.com/office/drawing/2010/main" val="0"/>
                         </a:ext>
                       </a:extLst>
                     </a:blip>
-                    <a:srcRect l="24694" t="8501" b="31699"/>
+                    <a:srcRect/>
+                    <a:stretch>
+                      <a:fillRect/>
+                    </a:stretch>
+                  </pic:blipFill>
+                  <pic:spPr bwMode="auto">
+                    <a:xfrm>
+                      <a:off x="0" y="0"/>
+                      <a:ext cx="2266950" cy="1238250"/>
+                    </a:xfrm>
+                    <a:prstGeom prst="rect">
+                      <a:avLst/>
+                    </a:prstGeom>
+                    <a:noFill/>
+                    <a:ln>
+                      <a:noFill/>
+                    </a:ln>
+                  </pic:spPr>
+                </pic:pic>
+              </a:graphicData>
+            </a:graphic>
+            <wp14:sizeRelH relativeFrom="margin">
+              <wp14:pctWidth>0</wp14:pctWidth>
+            </wp14:sizeRelH>
+            <wp14:sizeRelV relativeFrom="margin">
+              <wp14:pctHeight>0</wp14:pctHeight>
+            </wp14:sizeRelV>
+          </wp:anchor>
+        </w:drawing>
+      </w:r>
+      <w:r>
+        <w:rPr>
+          <w:rFonts w:ascii="Arial" w:hAnsi="Arial" w:cs="Arial"/>
+          <w:b/>
+          <w:bCs/>
+          <w:noProof/>
+          <w:lang w:eastAsia="es-EC"/>
+        </w:rPr>
+        <w:drawing>
+          <wp:anchor distT="0" distB="0" distL="114300" distR="114300" simplePos="0" relativeHeight="251688960" behindDoc="1" locked="0" layoutInCell="1" allowOverlap="1" wp14:anchorId="0EA09B92" wp14:editId="59322A02">
+            <wp:simplePos x="0" y="0"/>
+            <wp:positionH relativeFrom="column">
+              <wp:posOffset>-814070</wp:posOffset>
+            </wp:positionH>
+            <wp:positionV relativeFrom="paragraph">
+              <wp:posOffset>2755265</wp:posOffset>
+            </wp:positionV>
+            <wp:extent cx="2257425" cy="1152525"/>
+            <wp:effectExtent l="0" t="0" r="9525" b="9525"/>
+            <wp:wrapTight wrapText="bothSides">
+              <wp:wrapPolygon edited="0">
+                <wp:start x="0" y="0"/>
+                <wp:lineTo x="0" y="21421"/>
+                <wp:lineTo x="21509" y="21421"/>
+                <wp:lineTo x="21509" y="0"/>
+                <wp:lineTo x="0" y="0"/>
+              </wp:wrapPolygon>
+            </wp:wrapTight>
+            <wp:docPr id="26" name="Imagen 26"/>
+            <wp:cNvGraphicFramePr>
+              <a:graphicFrameLocks xmlns:a="http://schemas.openxmlformats.org/drawingml/2006/main" noChangeAspect="1"/>
+            </wp:cNvGraphicFramePr>
+            <a:graphic xmlns:a="http://schemas.openxmlformats.org/drawingml/2006/main">
+              <a:graphicData uri="http://schemas.openxmlformats.org/drawingml/2006/picture">
+                <pic:pic xmlns:pic="http://schemas.openxmlformats.org/drawingml/2006/picture">
+                  <pic:nvPicPr>
+                    <pic:cNvPr id="0" name="Picture 10"/>
+                    <pic:cNvPicPr>
+                      <a:picLocks noChangeAspect="1" noChangeArrowheads="1"/>
+                    </pic:cNvPicPr>
+                  </pic:nvPicPr>
+                  <pic:blipFill rotWithShape="1">
+                    <a:blip r:embed="rId21">
+                      <a:extLst>
+                        <a:ext uri="{28A0092B-C50C-407E-A947-70E740481C1C}">
+                          <a14:useLocalDpi xmlns:a14="http://schemas.microsoft.com/office/drawing/2010/main" val="0"/>
+                        </a:ext>
+                      </a:extLst>
+                    </a:blip>
+                    <a:srcRect l="61735" t="6889" r="11983" b="63459"/>
                     <a:stretch/>
                   </pic:blipFill>
                   <pic:spPr bwMode="auto">
                     <a:xfrm>
                       <a:off x="0" y="0"/>
-                      <a:ext cx="2304415" cy="1143000"/>
+                      <a:ext cx="2257425" cy="1152525"/>
                     </a:xfrm>
                     <a:prstGeom prst="rect">
                       <a:avLst/>
@@ -8215,7 +8418,89 @@
           <w:lang w:eastAsia="es-EC"/>
         </w:rPr>
         <w:drawing>
-          <wp:anchor distT="0" distB="0" distL="114300" distR="114300" simplePos="0" relativeHeight="251683840" behindDoc="1" locked="0" layoutInCell="1" allowOverlap="1" wp14:anchorId="0783B249" wp14:editId="3DC38790">
+          <wp:anchor distT="0" distB="0" distL="114300" distR="114300" simplePos="0" relativeHeight="251691008" behindDoc="1" locked="0" layoutInCell="1" allowOverlap="1" wp14:anchorId="788332DC" wp14:editId="139C2B1F">
+            <wp:simplePos x="0" y="0"/>
+            <wp:positionH relativeFrom="column">
+              <wp:posOffset>4110990</wp:posOffset>
+            </wp:positionH>
+            <wp:positionV relativeFrom="paragraph">
+              <wp:posOffset>2726690</wp:posOffset>
+            </wp:positionV>
+            <wp:extent cx="1971675" cy="1190625"/>
+            <wp:effectExtent l="0" t="0" r="9525" b="9525"/>
+            <wp:wrapTight wrapText="bothSides">
+              <wp:wrapPolygon edited="0">
+                <wp:start x="0" y="0"/>
+                <wp:lineTo x="0" y="21427"/>
+                <wp:lineTo x="21496" y="21427"/>
+                <wp:lineTo x="21496" y="0"/>
+                <wp:lineTo x="0" y="0"/>
+              </wp:wrapPolygon>
+            </wp:wrapTight>
+            <wp:docPr id="28" name="Imagen 28"/>
+            <wp:cNvGraphicFramePr>
+              <a:graphicFrameLocks xmlns:a="http://schemas.openxmlformats.org/drawingml/2006/main" noChangeAspect="1"/>
+            </wp:cNvGraphicFramePr>
+            <a:graphic xmlns:a="http://schemas.openxmlformats.org/drawingml/2006/main">
+              <a:graphicData uri="http://schemas.openxmlformats.org/drawingml/2006/picture">
+                <pic:pic xmlns:pic="http://schemas.openxmlformats.org/drawingml/2006/picture">
+                  <pic:nvPicPr>
+                    <pic:cNvPr id="0" name="Picture 12"/>
+                    <pic:cNvPicPr>
+                      <a:picLocks noChangeAspect="1" noChangeArrowheads="1"/>
+                    </pic:cNvPicPr>
+                  </pic:nvPicPr>
+                  <pic:blipFill rotWithShape="1">
+                    <a:blip r:embed="rId22" cstate="print">
+                      <a:extLst>
+                        <a:ext uri="{28A0092B-C50C-407E-A947-70E740481C1C}">
+                          <a14:useLocalDpi xmlns:a14="http://schemas.microsoft.com/office/drawing/2010/main" val="0"/>
+                        </a:ext>
+                      </a:extLst>
+                    </a:blip>
+                    <a:srcRect l="26859" t="11558" r="27376" b="24229"/>
+                    <a:stretch/>
+                  </pic:blipFill>
+                  <pic:spPr bwMode="auto">
+                    <a:xfrm>
+                      <a:off x="0" y="0"/>
+                      <a:ext cx="1971675" cy="1190625"/>
+                    </a:xfrm>
+                    <a:prstGeom prst="rect">
+                      <a:avLst/>
+                    </a:prstGeom>
+                    <a:noFill/>
+                    <a:ln>
+                      <a:noFill/>
+                    </a:ln>
+                    <a:extLst>
+                      <a:ext uri="{53640926-AAD7-44D8-BBD7-CCE9431645EC}">
+                        <a14:shadowObscured xmlns:a14="http://schemas.microsoft.com/office/drawing/2010/main"/>
+                      </a:ext>
+                    </a:extLst>
+                  </pic:spPr>
+                </pic:pic>
+              </a:graphicData>
+            </a:graphic>
+            <wp14:sizeRelH relativeFrom="margin">
+              <wp14:pctWidth>0</wp14:pctWidth>
+            </wp14:sizeRelH>
+            <wp14:sizeRelV relativeFrom="margin">
+              <wp14:pctHeight>0</wp14:pctHeight>
+            </wp14:sizeRelV>
+          </wp:anchor>
+        </w:drawing>
+      </w:r>
+      <w:r>
+        <w:rPr>
+          <w:rFonts w:ascii="Arial" w:hAnsi="Arial" w:cs="Arial"/>
+          <w:b/>
+          <w:bCs/>
+          <w:noProof/>
+          <w:lang w:eastAsia="es-EC"/>
+        </w:rPr>
+        <w:drawing>
+          <wp:anchor distT="0" distB="0" distL="114300" distR="114300" simplePos="0" relativeHeight="251683840" behindDoc="1" locked="0" layoutInCell="1" allowOverlap="1" wp14:anchorId="0783B249" wp14:editId="45C2B9DD">
             <wp:simplePos x="0" y="0"/>
             <wp:positionH relativeFrom="margin">
               <wp:posOffset>1596390</wp:posOffset>
@@ -8248,7 +8533,7 @@
                     </pic:cNvPicPr>
                   </pic:nvPicPr>
                   <pic:blipFill rotWithShape="1">
-                    <a:blip r:embed="rId21" cstate="print">
+                    <a:blip r:embed="rId23" cstate="print">
                       <a:extLst>
                         <a:ext uri="{28A0092B-C50C-407E-A947-70E740481C1C}">
                           <a14:useLocalDpi xmlns:a14="http://schemas.microsoft.com/office/drawing/2010/main" val="0"/>
@@ -8288,6 +8573,19 @@
           </wp:anchor>
         </w:drawing>
       </w:r>
+    </w:p>
+    <w:p>
+      <w:pPr>
+        <w:pStyle w:val="Sinespaciado"/>
+        <w:spacing w:line="360" w:lineRule="auto"/>
+        <w:jc w:val="both"/>
+        <w:rPr>
+          <w:rFonts w:ascii="Arial" w:hAnsi="Arial" w:cs="Arial"/>
+          <w:b/>
+          <w:bCs/>
+          <w:lang w:eastAsia="es-EC"/>
+        </w:rPr>
+      </w:pPr>
       <w:r>
         <w:rPr>
           <w:rFonts w:ascii="Arial" w:hAnsi="Arial" w:cs="Arial"/>
@@ -8297,26 +8595,26 @@
           <w:lang w:eastAsia="es-EC"/>
         </w:rPr>
         <w:drawing>
-          <wp:anchor distT="0" distB="0" distL="114300" distR="114300" simplePos="0" relativeHeight="251682816" behindDoc="1" locked="0" layoutInCell="1" allowOverlap="1" wp14:anchorId="4F956ADD" wp14:editId="53D208FE">
+          <wp:anchor distT="0" distB="0" distL="114300" distR="114300" simplePos="0" relativeHeight="251689984" behindDoc="1" locked="0" layoutInCell="1" allowOverlap="1" wp14:anchorId="715CB3B7" wp14:editId="6B4DE41C">
             <wp:simplePos x="0" y="0"/>
-            <wp:positionH relativeFrom="margin">
-              <wp:posOffset>-975360</wp:posOffset>
+            <wp:positionH relativeFrom="column">
+              <wp:posOffset>1577340</wp:posOffset>
             </wp:positionH>
             <wp:positionV relativeFrom="paragraph">
-              <wp:posOffset>177800</wp:posOffset>
+              <wp:posOffset>2527935</wp:posOffset>
             </wp:positionV>
-            <wp:extent cx="2409825" cy="1143000"/>
+            <wp:extent cx="2371725" cy="1143000"/>
             <wp:effectExtent l="0" t="0" r="9525" b="0"/>
             <wp:wrapTight wrapText="bothSides">
               <wp:wrapPolygon edited="0">
                 <wp:start x="0" y="0"/>
                 <wp:lineTo x="0" y="21240"/>
-                <wp:lineTo x="21515" y="21240"/>
-                <wp:lineTo x="21515" y="0"/>
+                <wp:lineTo x="21513" y="21240"/>
+                <wp:lineTo x="21513" y="0"/>
                 <wp:lineTo x="0" y="0"/>
               </wp:wrapPolygon>
             </wp:wrapTight>
-            <wp:docPr id="20" name="Imagen 20"/>
+            <wp:docPr id="27" name="Imagen 27"/>
             <wp:cNvGraphicFramePr>
               <a:graphicFrameLocks xmlns:a="http://schemas.openxmlformats.org/drawingml/2006/main" noChangeAspect="1"/>
             </wp:cNvGraphicFramePr>
@@ -8324,26 +8622,26 @@
               <a:graphicData uri="http://schemas.openxmlformats.org/drawingml/2006/picture">
                 <pic:pic xmlns:pic="http://schemas.openxmlformats.org/drawingml/2006/picture">
                   <pic:nvPicPr>
-                    <pic:cNvPr id="0" name="Picture 4"/>
+                    <pic:cNvPr id="0" name="Picture 11"/>
                     <pic:cNvPicPr>
                       <a:picLocks noChangeAspect="1" noChangeArrowheads="1"/>
                     </pic:cNvPicPr>
                   </pic:nvPicPr>
                   <pic:blipFill rotWithShape="1">
-                    <a:blip r:embed="rId22" cstate="print">
+                    <a:blip r:embed="rId24" cstate="print">
                       <a:extLst>
                         <a:ext uri="{28A0092B-C50C-407E-A947-70E740481C1C}">
                           <a14:useLocalDpi xmlns:a14="http://schemas.microsoft.com/office/drawing/2010/main" val="0"/>
                         </a:ext>
                       </a:extLst>
                     </a:blip>
-                    <a:srcRect l="14111" t="16326" r="11629" b="16668"/>
+                    <a:srcRect l="25752" t="14315" r="29092" b="23648"/>
                     <a:stretch/>
                   </pic:blipFill>
                   <pic:spPr bwMode="auto">
                     <a:xfrm>
                       <a:off x="0" y="0"/>
-                      <a:ext cx="2409825" cy="1143000"/>
+                      <a:ext cx="2371725" cy="1143000"/>
                     </a:xfrm>
                     <a:prstGeom prst="rect">
                       <a:avLst/>
@@ -8370,19 +8668,6 @@
           </wp:anchor>
         </w:drawing>
       </w:r>
-    </w:p>
-    <w:p>
-      <w:pPr>
-        <w:pStyle w:val="Sinespaciado"/>
-        <w:spacing w:line="360" w:lineRule="auto"/>
-        <w:jc w:val="both"/>
-        <w:rPr>
-          <w:rFonts w:ascii="Arial" w:hAnsi="Arial" w:cs="Arial"/>
-          <w:b/>
-          <w:bCs/>
-          <w:lang w:eastAsia="es-EC"/>
-        </w:rPr>
-      </w:pPr>
       <w:r>
         <w:rPr>
           <w:rFonts w:ascii="Arial" w:hAnsi="Arial" w:cs="Arial"/>
@@ -8392,26 +8677,26 @@
           <w:lang w:eastAsia="es-EC"/>
         </w:rPr>
         <w:drawing>
-          <wp:anchor distT="0" distB="0" distL="114300" distR="114300" simplePos="0" relativeHeight="251696128" behindDoc="1" locked="0" layoutInCell="1" allowOverlap="1" wp14:anchorId="4AAF3DA8" wp14:editId="399D0D7E">
+          <wp:anchor distT="0" distB="0" distL="114300" distR="114300" simplePos="0" relativeHeight="251686912" behindDoc="1" locked="0" layoutInCell="1" allowOverlap="1" wp14:anchorId="4E256F88" wp14:editId="62A84502">
             <wp:simplePos x="0" y="0"/>
-            <wp:positionH relativeFrom="margin">
-              <wp:posOffset>1443990</wp:posOffset>
+            <wp:positionH relativeFrom="column">
+              <wp:posOffset>1567815</wp:posOffset>
             </wp:positionH>
             <wp:positionV relativeFrom="paragraph">
-              <wp:posOffset>5156835</wp:posOffset>
+              <wp:posOffset>1232535</wp:posOffset>
             </wp:positionV>
-            <wp:extent cx="2476500" cy="1524000"/>
+            <wp:extent cx="2457450" cy="1200150"/>
             <wp:effectExtent l="0" t="0" r="0" b="0"/>
             <wp:wrapTight wrapText="bothSides">
               <wp:wrapPolygon edited="0">
                 <wp:start x="0" y="0"/>
-                <wp:lineTo x="0" y="21330"/>
-                <wp:lineTo x="21434" y="21330"/>
-                <wp:lineTo x="21434" y="0"/>
+                <wp:lineTo x="0" y="21257"/>
+                <wp:lineTo x="21433" y="21257"/>
+                <wp:lineTo x="21433" y="0"/>
                 <wp:lineTo x="0" y="0"/>
               </wp:wrapPolygon>
             </wp:wrapTight>
-            <wp:docPr id="33" name="Imagen 33"/>
+            <wp:docPr id="24" name="Imagen 24"/>
             <wp:cNvGraphicFramePr>
               <a:graphicFrameLocks xmlns:a="http://schemas.openxmlformats.org/drawingml/2006/main" noChangeAspect="1"/>
             </wp:cNvGraphicFramePr>
@@ -8419,26 +8704,26 @@
               <a:graphicData uri="http://schemas.openxmlformats.org/drawingml/2006/picture">
                 <pic:pic xmlns:pic="http://schemas.openxmlformats.org/drawingml/2006/picture">
                   <pic:nvPicPr>
-                    <pic:cNvPr id="0" name="Picture 17"/>
+                    <pic:cNvPr id="0" name="Picture 8"/>
                     <pic:cNvPicPr>
                       <a:picLocks noChangeAspect="1" noChangeArrowheads="1"/>
                     </pic:cNvPicPr>
                   </pic:nvPicPr>
                   <pic:blipFill rotWithShape="1">
-                    <a:blip r:embed="rId23">
+                    <a:blip r:embed="rId25" cstate="print">
                       <a:extLst>
                         <a:ext uri="{28A0092B-C50C-407E-A947-70E740481C1C}">
                           <a14:useLocalDpi xmlns:a14="http://schemas.microsoft.com/office/drawing/2010/main" val="0"/>
                         </a:ext>
                       </a:extLst>
                     </a:blip>
-                    <a:srcRect r="10928" b="60784"/>
+                    <a:srcRect l="13405" t="2492" r="9866" b="9034"/>
                     <a:stretch/>
                   </pic:blipFill>
                   <pic:spPr bwMode="auto">
                     <a:xfrm>
                       <a:off x="0" y="0"/>
-                      <a:ext cx="2476500" cy="1524000"/>
+                      <a:ext cx="2457450" cy="1200150"/>
                     </a:xfrm>
                     <a:prstGeom prst="rect">
                       <a:avLst/>
@@ -8459,9 +8744,25 @@
             <wp14:sizeRelH relativeFrom="margin">
               <wp14:pctWidth>0</wp14:pctWidth>
             </wp14:sizeRelH>
+            <wp14:sizeRelV relativeFrom="margin">
+              <wp14:pctHeight>0</wp14:pctHeight>
+            </wp14:sizeRelV>
           </wp:anchor>
         </w:drawing>
       </w:r>
+    </w:p>
+    <w:p>
+      <w:pPr>
+        <w:pStyle w:val="Sinespaciado"/>
+        <w:spacing w:line="360" w:lineRule="auto"/>
+        <w:jc w:val="both"/>
+        <w:rPr>
+          <w:rFonts w:ascii="Arial" w:hAnsi="Arial" w:cs="Arial"/>
+          <w:b/>
+          <w:bCs/>
+          <w:lang w:eastAsia="es-EC"/>
+        </w:rPr>
+      </w:pPr>
       <w:r>
         <w:rPr>
           <w:rFonts w:ascii="Arial" w:hAnsi="Arial" w:cs="Arial"/>
@@ -8471,26 +8772,26 @@
           <w:lang w:eastAsia="es-EC"/>
         </w:rPr>
         <w:drawing>
-          <wp:anchor distT="0" distB="0" distL="114300" distR="114300" simplePos="0" relativeHeight="251694080" behindDoc="1" locked="0" layoutInCell="1" allowOverlap="1" wp14:anchorId="39E4D696" wp14:editId="64E2DBA6">
+          <wp:anchor distT="0" distB="0" distL="114300" distR="114300" simplePos="0" relativeHeight="251692032" behindDoc="1" locked="0" layoutInCell="1" allowOverlap="1" wp14:anchorId="18714DCC" wp14:editId="4FD6A4A5">
             <wp:simplePos x="0" y="0"/>
             <wp:positionH relativeFrom="column">
-              <wp:posOffset>-994410</wp:posOffset>
+              <wp:posOffset>-832485</wp:posOffset>
             </wp:positionH>
             <wp:positionV relativeFrom="paragraph">
-              <wp:posOffset>5137785</wp:posOffset>
+              <wp:posOffset>245745</wp:posOffset>
             </wp:positionV>
-            <wp:extent cx="2371725" cy="1524000"/>
-            <wp:effectExtent l="0" t="0" r="9525" b="0"/>
+            <wp:extent cx="2219325" cy="1304925"/>
+            <wp:effectExtent l="0" t="0" r="9525" b="9525"/>
             <wp:wrapTight wrapText="bothSides">
               <wp:wrapPolygon edited="0">
                 <wp:start x="0" y="0"/>
-                <wp:lineTo x="0" y="21330"/>
-                <wp:lineTo x="21513" y="21330"/>
-                <wp:lineTo x="21513" y="0"/>
+                <wp:lineTo x="0" y="21442"/>
+                <wp:lineTo x="21507" y="21442"/>
+                <wp:lineTo x="21507" y="0"/>
                 <wp:lineTo x="0" y="0"/>
               </wp:wrapPolygon>
             </wp:wrapTight>
-            <wp:docPr id="31" name="Imagen 31"/>
+            <wp:docPr id="29" name="Imagen 29"/>
             <wp:cNvGraphicFramePr>
               <a:graphicFrameLocks xmlns:a="http://schemas.openxmlformats.org/drawingml/2006/main" noChangeAspect="1"/>
             </wp:cNvGraphicFramePr>
@@ -8498,26 +8799,26 @@
               <a:graphicData uri="http://schemas.openxmlformats.org/drawingml/2006/picture">
                 <pic:pic xmlns:pic="http://schemas.openxmlformats.org/drawingml/2006/picture">
                   <pic:nvPicPr>
-                    <pic:cNvPr id="0" name="Picture 15"/>
+                    <pic:cNvPr id="0" name="Picture 13"/>
                     <pic:cNvPicPr>
                       <a:picLocks noChangeAspect="1" noChangeArrowheads="1"/>
                     </pic:cNvPicPr>
                   </pic:nvPicPr>
                   <pic:blipFill rotWithShape="1">
-                    <a:blip r:embed="rId24">
+                    <a:blip r:embed="rId26">
                       <a:extLst>
                         <a:ext uri="{28A0092B-C50C-407E-A947-70E740481C1C}">
                           <a14:useLocalDpi xmlns:a14="http://schemas.microsoft.com/office/drawing/2010/main" val="0"/>
                         </a:ext>
                       </a:extLst>
                     </a:blip>
-                    <a:srcRect r="38996" b="62963"/>
+                    <a:srcRect t="1686" r="28077" b="56998"/>
                     <a:stretch/>
                   </pic:blipFill>
                   <pic:spPr bwMode="auto">
                     <a:xfrm>
                       <a:off x="0" y="0"/>
-                      <a:ext cx="2371725" cy="1524000"/>
+                      <a:ext cx="2219325" cy="1304925"/>
                     </a:xfrm>
                     <a:prstGeom prst="rect">
                       <a:avLst/>
@@ -8538,9 +8839,25 @@
             <wp14:sizeRelH relativeFrom="margin">
               <wp14:pctWidth>0</wp14:pctWidth>
             </wp14:sizeRelH>
+            <wp14:sizeRelV relativeFrom="margin">
+              <wp14:pctHeight>0</wp14:pctHeight>
+            </wp14:sizeRelV>
           </wp:anchor>
         </w:drawing>
       </w:r>
+    </w:p>
+    <w:p>
+      <w:pPr>
+        <w:pStyle w:val="Sinespaciado"/>
+        <w:spacing w:line="360" w:lineRule="auto"/>
+        <w:jc w:val="both"/>
+        <w:rPr>
+          <w:rFonts w:ascii="Arial" w:hAnsi="Arial" w:cs="Arial"/>
+          <w:b/>
+          <w:bCs/>
+          <w:lang w:eastAsia="es-EC"/>
+        </w:rPr>
+      </w:pPr>
       <w:r>
         <w:rPr>
           <w:rFonts w:ascii="Arial" w:hAnsi="Arial" w:cs="Arial"/>
@@ -8550,13 +8867,95 @@
           <w:lang w:eastAsia="es-EC"/>
         </w:rPr>
         <w:drawing>
-          <wp:anchor distT="0" distB="0" distL="114300" distR="114300" simplePos="0" relativeHeight="251693056" behindDoc="1" locked="0" layoutInCell="1" allowOverlap="1" wp14:anchorId="1840A124" wp14:editId="75567D1A">
+          <wp:anchor distT="0" distB="0" distL="114300" distR="114300" simplePos="0" relativeHeight="251695104" behindDoc="1" locked="0" layoutInCell="1" allowOverlap="1" wp14:anchorId="3356FB66" wp14:editId="51325B44">
             <wp:simplePos x="0" y="0"/>
             <wp:positionH relativeFrom="column">
-              <wp:posOffset>1482090</wp:posOffset>
+              <wp:posOffset>4025265</wp:posOffset>
             </wp:positionH>
             <wp:positionV relativeFrom="paragraph">
-              <wp:posOffset>3709035</wp:posOffset>
+              <wp:posOffset>271780</wp:posOffset>
+            </wp:positionV>
+            <wp:extent cx="2133600" cy="1276350"/>
+            <wp:effectExtent l="0" t="0" r="0" b="0"/>
+            <wp:wrapTight wrapText="bothSides">
+              <wp:wrapPolygon edited="0">
+                <wp:start x="0" y="0"/>
+                <wp:lineTo x="0" y="21278"/>
+                <wp:lineTo x="21407" y="21278"/>
+                <wp:lineTo x="21407" y="0"/>
+                <wp:lineTo x="0" y="0"/>
+              </wp:wrapPolygon>
+            </wp:wrapTight>
+            <wp:docPr id="32" name="Imagen 32"/>
+            <wp:cNvGraphicFramePr>
+              <a:graphicFrameLocks xmlns:a="http://schemas.openxmlformats.org/drawingml/2006/main" noChangeAspect="1"/>
+            </wp:cNvGraphicFramePr>
+            <a:graphic xmlns:a="http://schemas.openxmlformats.org/drawingml/2006/main">
+              <a:graphicData uri="http://schemas.openxmlformats.org/drawingml/2006/picture">
+                <pic:pic xmlns:pic="http://schemas.openxmlformats.org/drawingml/2006/picture">
+                  <pic:nvPicPr>
+                    <pic:cNvPr id="0" name="Picture 16"/>
+                    <pic:cNvPicPr>
+                      <a:picLocks noChangeAspect="1" noChangeArrowheads="1"/>
+                    </pic:cNvPicPr>
+                  </pic:nvPicPr>
+                  <pic:blipFill rotWithShape="1">
+                    <a:blip r:embed="rId27">
+                      <a:extLst>
+                        <a:ext uri="{28A0092B-C50C-407E-A947-70E740481C1C}">
+                          <a14:useLocalDpi xmlns:a14="http://schemas.microsoft.com/office/drawing/2010/main" val="0"/>
+                        </a:ext>
+                      </a:extLst>
+                    </a:blip>
+                    <a:srcRect r="62606" b="70630"/>
+                    <a:stretch/>
+                  </pic:blipFill>
+                  <pic:spPr bwMode="auto">
+                    <a:xfrm>
+                      <a:off x="0" y="0"/>
+                      <a:ext cx="2133600" cy="1276350"/>
+                    </a:xfrm>
+                    <a:prstGeom prst="rect">
+                      <a:avLst/>
+                    </a:prstGeom>
+                    <a:noFill/>
+                    <a:ln>
+                      <a:noFill/>
+                    </a:ln>
+                    <a:extLst>
+                      <a:ext uri="{53640926-AAD7-44D8-BBD7-CCE9431645EC}">
+                        <a14:shadowObscured xmlns:a14="http://schemas.microsoft.com/office/drawing/2010/main"/>
+                      </a:ext>
+                    </a:extLst>
+                  </pic:spPr>
+                </pic:pic>
+              </a:graphicData>
+            </a:graphic>
+            <wp14:sizeRelH relativeFrom="margin">
+              <wp14:pctWidth>0</wp14:pctWidth>
+            </wp14:sizeRelH>
+            <wp14:sizeRelV relativeFrom="margin">
+              <wp14:pctHeight>0</wp14:pctHeight>
+            </wp14:sizeRelV>
+          </wp:anchor>
+        </w:drawing>
+      </w:r>
+      <w:r>
+        <w:rPr>
+          <w:rFonts w:ascii="Arial" w:hAnsi="Arial" w:cs="Arial"/>
+          <w:b/>
+          <w:bCs/>
+          <w:noProof/>
+          <w:lang w:eastAsia="es-EC"/>
+        </w:rPr>
+        <w:drawing>
+          <wp:anchor distT="0" distB="0" distL="114300" distR="114300" simplePos="0" relativeHeight="251693056" behindDoc="1" locked="0" layoutInCell="1" allowOverlap="1" wp14:anchorId="1840A124" wp14:editId="309C62A3">
+            <wp:simplePos x="0" y="0"/>
+            <wp:positionH relativeFrom="margin">
+              <wp:align>center</wp:align>
+            </wp:positionH>
+            <wp:positionV relativeFrom="paragraph">
+              <wp:posOffset>285115</wp:posOffset>
             </wp:positionV>
             <wp:extent cx="2457450" cy="1304925"/>
             <wp:effectExtent l="0" t="0" r="0" b="9525"/>
@@ -8583,7 +8982,7 @@
                     </pic:cNvPicPr>
                   </pic:nvPicPr>
                   <pic:blipFill rotWithShape="1">
-                    <a:blip r:embed="rId25" cstate="print">
+                    <a:blip r:embed="rId28" cstate="print">
                       <a:extLst>
                         <a:ext uri="{28A0092B-C50C-407E-A947-70E740481C1C}">
                           <a14:useLocalDpi xmlns:a14="http://schemas.microsoft.com/office/drawing/2010/main" val="0"/>
@@ -8623,6 +9022,58 @@
           </wp:anchor>
         </w:drawing>
       </w:r>
+    </w:p>
+    <w:p>
+      <w:pPr>
+        <w:pStyle w:val="Sinespaciado"/>
+        <w:spacing w:line="360" w:lineRule="auto"/>
+        <w:jc w:val="both"/>
+        <w:rPr>
+          <w:rFonts w:ascii="Arial" w:hAnsi="Arial" w:cs="Arial"/>
+          <w:b/>
+          <w:bCs/>
+          <w:lang w:eastAsia="es-EC"/>
+        </w:rPr>
+      </w:pPr>
+    </w:p>
+    <w:p>
+      <w:pPr>
+        <w:pStyle w:val="Sinespaciado"/>
+        <w:spacing w:line="360" w:lineRule="auto"/>
+        <w:jc w:val="both"/>
+        <w:rPr>
+          <w:rFonts w:ascii="Arial" w:hAnsi="Arial" w:cs="Arial"/>
+          <w:b/>
+          <w:bCs/>
+          <w:lang w:eastAsia="es-EC"/>
+        </w:rPr>
+      </w:pPr>
+    </w:p>
+    <w:p>
+      <w:pPr>
+        <w:pStyle w:val="Sinespaciado"/>
+        <w:spacing w:line="360" w:lineRule="auto"/>
+        <w:jc w:val="both"/>
+        <w:rPr>
+          <w:rFonts w:ascii="Arial" w:hAnsi="Arial" w:cs="Arial"/>
+          <w:b/>
+          <w:bCs/>
+          <w:lang w:eastAsia="es-EC"/>
+        </w:rPr>
+      </w:pPr>
+    </w:p>
+    <w:p>
+      <w:pPr>
+        <w:pStyle w:val="Sinespaciado"/>
+        <w:spacing w:line="360" w:lineRule="auto"/>
+        <w:jc w:val="both"/>
+        <w:rPr>
+          <w:rFonts w:ascii="Arial" w:hAnsi="Arial" w:cs="Arial"/>
+          <w:b/>
+          <w:bCs/>
+          <w:lang w:eastAsia="es-EC"/>
+        </w:rPr>
+      </w:pPr>
       <w:r>
         <w:rPr>
           <w:rFonts w:ascii="Arial" w:hAnsi="Arial" w:cs="Arial"/>
@@ -8632,26 +9083,18 @@
           <w:lang w:eastAsia="es-EC"/>
         </w:rPr>
         <w:drawing>
-          <wp:anchor distT="0" distB="0" distL="114300" distR="114300" simplePos="0" relativeHeight="251692032" behindDoc="1" locked="0" layoutInCell="1" allowOverlap="1" wp14:anchorId="18714DCC" wp14:editId="216DB1E2">
+          <wp:anchor distT="0" distB="0" distL="114300" distR="114300" simplePos="0" relativeHeight="251694080" behindDoc="0" locked="0" layoutInCell="1" allowOverlap="1" wp14:anchorId="39E4D696" wp14:editId="06AC8CB1">
             <wp:simplePos x="0" y="0"/>
-            <wp:positionH relativeFrom="column">
-              <wp:posOffset>-994410</wp:posOffset>
+            <wp:positionH relativeFrom="page">
+              <wp:posOffset>266700</wp:posOffset>
             </wp:positionH>
             <wp:positionV relativeFrom="paragraph">
-              <wp:posOffset>3718560</wp:posOffset>
+              <wp:posOffset>135890</wp:posOffset>
             </wp:positionV>
-            <wp:extent cx="2409825" cy="1304925"/>
-            <wp:effectExtent l="0" t="0" r="9525" b="9525"/>
-            <wp:wrapTight wrapText="bothSides">
-              <wp:wrapPolygon edited="0">
-                <wp:start x="0" y="0"/>
-                <wp:lineTo x="0" y="21442"/>
-                <wp:lineTo x="21515" y="21442"/>
-                <wp:lineTo x="21515" y="0"/>
-                <wp:lineTo x="0" y="0"/>
-              </wp:wrapPolygon>
-            </wp:wrapTight>
-            <wp:docPr id="29" name="Imagen 29"/>
+            <wp:extent cx="2105025" cy="1524000"/>
+            <wp:effectExtent l="0" t="0" r="9525" b="0"/>
+            <wp:wrapNone/>
+            <wp:docPr id="31" name="Imagen 31"/>
             <wp:cNvGraphicFramePr>
               <a:graphicFrameLocks xmlns:a="http://schemas.openxmlformats.org/drawingml/2006/main" noChangeAspect="1"/>
             </wp:cNvGraphicFramePr>
@@ -8659,26 +9102,105 @@
               <a:graphicData uri="http://schemas.openxmlformats.org/drawingml/2006/picture">
                 <pic:pic xmlns:pic="http://schemas.openxmlformats.org/drawingml/2006/picture">
                   <pic:nvPicPr>
-                    <pic:cNvPr id="0" name="Picture 13"/>
+                    <pic:cNvPr id="0" name="Picture 15"/>
                     <pic:cNvPicPr>
                       <a:picLocks noChangeAspect="1" noChangeArrowheads="1"/>
                     </pic:cNvPicPr>
                   </pic:nvPicPr>
                   <pic:blipFill rotWithShape="1">
-                    <a:blip r:embed="rId26">
+                    <a:blip r:embed="rId29">
                       <a:extLst>
                         <a:ext uri="{28A0092B-C50C-407E-A947-70E740481C1C}">
                           <a14:useLocalDpi xmlns:a14="http://schemas.microsoft.com/office/drawing/2010/main" val="0"/>
                         </a:ext>
                       </a:extLst>
                     </a:blip>
-                    <a:srcRect t="1686" r="28077" b="56998"/>
+                    <a:srcRect r="38996" b="62963"/>
                     <a:stretch/>
                   </pic:blipFill>
                   <pic:spPr bwMode="auto">
                     <a:xfrm>
                       <a:off x="0" y="0"/>
-                      <a:ext cx="2409825" cy="1304925"/>
+                      <a:ext cx="2105025" cy="1524000"/>
+                    </a:xfrm>
+                    <a:prstGeom prst="rect">
+                      <a:avLst/>
+                    </a:prstGeom>
+                    <a:noFill/>
+                    <a:ln>
+                      <a:noFill/>
+                    </a:ln>
+                    <a:extLst>
+                      <a:ext uri="{53640926-AAD7-44D8-BBD7-CCE9431645EC}">
+                        <a14:shadowObscured xmlns:a14="http://schemas.microsoft.com/office/drawing/2010/main"/>
+                      </a:ext>
+                    </a:extLst>
+                  </pic:spPr>
+                </pic:pic>
+              </a:graphicData>
+            </a:graphic>
+            <wp14:sizeRelH relativeFrom="margin">
+              <wp14:pctWidth>0</wp14:pctWidth>
+            </wp14:sizeRelH>
+          </wp:anchor>
+        </w:drawing>
+      </w:r>
+      <w:r>
+        <w:rPr>
+          <w:rFonts w:ascii="Arial" w:hAnsi="Arial" w:cs="Arial"/>
+          <w:b/>
+          <w:bCs/>
+          <w:noProof/>
+          <w:lang w:eastAsia="es-EC"/>
+        </w:rPr>
+        <w:drawing>
+          <wp:anchor distT="0" distB="0" distL="114300" distR="114300" simplePos="0" relativeHeight="251697152" behindDoc="1" locked="0" layoutInCell="1" allowOverlap="1" wp14:anchorId="06D0CB13" wp14:editId="77A51544">
+            <wp:simplePos x="0" y="0"/>
+            <wp:positionH relativeFrom="page">
+              <wp:posOffset>5105400</wp:posOffset>
+            </wp:positionH>
+            <wp:positionV relativeFrom="paragraph">
+              <wp:posOffset>21590</wp:posOffset>
+            </wp:positionV>
+            <wp:extent cx="2114550" cy="1581150"/>
+            <wp:effectExtent l="0" t="0" r="0" b="0"/>
+            <wp:wrapTight wrapText="bothSides">
+              <wp:wrapPolygon edited="0">
+                <wp:start x="0" y="0"/>
+                <wp:lineTo x="0" y="21340"/>
+                <wp:lineTo x="21405" y="21340"/>
+                <wp:lineTo x="21405" y="0"/>
+                <wp:lineTo x="0" y="0"/>
+              </wp:wrapPolygon>
+            </wp:wrapTight>
+            <wp:docPr id="34" name="Imagen 34"/>
+            <wp:cNvGraphicFramePr>
+              <a:graphicFrameLocks xmlns:a="http://schemas.openxmlformats.org/drawingml/2006/main" noChangeAspect="1"/>
+            </wp:cNvGraphicFramePr>
+            <a:graphic xmlns:a="http://schemas.openxmlformats.org/drawingml/2006/main">
+              <a:graphicData uri="http://schemas.openxmlformats.org/drawingml/2006/picture">
+                <pic:pic xmlns:pic="http://schemas.openxmlformats.org/drawingml/2006/picture">
+                  <pic:nvPicPr>
+                    <pic:cNvPr id="0" name="Picture 18"/>
+                    <pic:cNvPicPr>
+                      <a:picLocks noChangeAspect="1" noChangeArrowheads="1"/>
+                    </pic:cNvPicPr>
+                  </pic:nvPicPr>
+                  <pic:blipFill rotWithShape="1">
+                    <a:blip r:embed="rId30">
+                      <a:extLst>
+                        <a:ext uri="{28A0092B-C50C-407E-A947-70E740481C1C}">
+                          <a14:useLocalDpi xmlns:a14="http://schemas.microsoft.com/office/drawing/2010/main" val="0"/>
+                        </a:ext>
+                      </a:extLst>
+                    </a:blip>
+                    <a:srcRect r="10396" b="43269"/>
+                    <a:stretch/>
+                  </pic:blipFill>
+                  <pic:spPr bwMode="auto">
+                    <a:xfrm>
+                      <a:off x="0" y="0"/>
+                      <a:ext cx="2114550" cy="1581150"/>
                     </a:xfrm>
                     <a:prstGeom prst="rect">
                       <a:avLst/>
@@ -8714,26 +9236,18 @@
           <w:lang w:eastAsia="es-EC"/>
         </w:rPr>
         <w:drawing>
-          <wp:anchor distT="0" distB="0" distL="114300" distR="114300" simplePos="0" relativeHeight="251688960" behindDoc="1" locked="0" layoutInCell="1" allowOverlap="1" wp14:anchorId="0EA09B92" wp14:editId="3B22E1E6">
+          <wp:anchor distT="0" distB="0" distL="114300" distR="114300" simplePos="0" relativeHeight="251696128" behindDoc="0" locked="0" layoutInCell="1" allowOverlap="1" wp14:anchorId="4AAF3DA8" wp14:editId="6D99059C">
             <wp:simplePos x="0" y="0"/>
-            <wp:positionH relativeFrom="column">
-              <wp:posOffset>-994410</wp:posOffset>
+            <wp:positionH relativeFrom="margin">
+              <wp:align>center</wp:align>
             </wp:positionH>
             <wp:positionV relativeFrom="paragraph">
-              <wp:posOffset>2517775</wp:posOffset>
+              <wp:posOffset>134620</wp:posOffset>
             </wp:positionV>
-            <wp:extent cx="2438400" cy="1152525"/>
-            <wp:effectExtent l="0" t="0" r="0" b="9525"/>
-            <wp:wrapTight wrapText="bothSides">
-              <wp:wrapPolygon edited="0">
-                <wp:start x="0" y="0"/>
-                <wp:lineTo x="0" y="21421"/>
-                <wp:lineTo x="21431" y="21421"/>
-                <wp:lineTo x="21431" y="0"/>
-                <wp:lineTo x="0" y="0"/>
-              </wp:wrapPolygon>
-            </wp:wrapTight>
-            <wp:docPr id="26" name="Imagen 26"/>
+            <wp:extent cx="2476500" cy="1524000"/>
+            <wp:effectExtent l="0" t="0" r="0" b="0"/>
+            <wp:wrapNone/>
+            <wp:docPr id="33" name="Imagen 33"/>
             <wp:cNvGraphicFramePr>
               <a:graphicFrameLocks xmlns:a="http://schemas.openxmlformats.org/drawingml/2006/main" noChangeAspect="1"/>
             </wp:cNvGraphicFramePr>
@@ -8741,26 +9255,202 @@
               <a:graphicData uri="http://schemas.openxmlformats.org/drawingml/2006/picture">
                 <pic:pic xmlns:pic="http://schemas.openxmlformats.org/drawingml/2006/picture">
                   <pic:nvPicPr>
-                    <pic:cNvPr id="0" name="Picture 10"/>
+                    <pic:cNvPr id="0" name="Picture 17"/>
                     <pic:cNvPicPr>
                       <a:picLocks noChangeAspect="1" noChangeArrowheads="1"/>
                     </pic:cNvPicPr>
                   </pic:nvPicPr>
                   <pic:blipFill rotWithShape="1">
-                    <a:blip r:embed="rId27">
+                    <a:blip r:embed="rId31">
                       <a:extLst>
                         <a:ext uri="{28A0092B-C50C-407E-A947-70E740481C1C}">
                           <a14:useLocalDpi xmlns:a14="http://schemas.microsoft.com/office/drawing/2010/main" val="0"/>
                         </a:ext>
                       </a:extLst>
                     </a:blip>
-                    <a:srcRect l="61735" t="6889" r="11983" b="63459"/>
+                    <a:srcRect r="10928" b="60784"/>
                     <a:stretch/>
                   </pic:blipFill>
                   <pic:spPr bwMode="auto">
                     <a:xfrm>
                       <a:off x="0" y="0"/>
-                      <a:ext cx="2438400" cy="1152525"/>
+                      <a:ext cx="2476500" cy="1524000"/>
+                    </a:xfrm>
+                    <a:prstGeom prst="rect">
+                      <a:avLst/>
+                    </a:prstGeom>
+                    <a:noFill/>
+                    <a:ln>
+                      <a:noFill/>
+                    </a:ln>
+                    <a:extLst>
+                      <a:ext uri="{53640926-AAD7-44D8-BBD7-CCE9431645EC}">
+                        <a14:shadowObscured xmlns:a14="http://schemas.microsoft.com/office/drawing/2010/main"/>
+                      </a:ext>
+                    </a:extLst>
+                  </pic:spPr>
+                </pic:pic>
+              </a:graphicData>
+            </a:graphic>
+            <wp14:sizeRelH relativeFrom="margin">
+              <wp14:pctWidth>0</wp14:pctWidth>
+            </wp14:sizeRelH>
+          </wp:anchor>
+        </w:drawing>
+      </w:r>
+    </w:p>
+    <w:p>
+      <w:pPr>
+        <w:pStyle w:val="Sinespaciado"/>
+        <w:spacing w:line="360" w:lineRule="auto"/>
+        <w:jc w:val="both"/>
+        <w:rPr>
+          <w:rFonts w:ascii="Arial" w:hAnsi="Arial" w:cs="Arial"/>
+          <w:b/>
+          <w:bCs/>
+          <w:lang w:eastAsia="es-EC"/>
+        </w:rPr>
+      </w:pPr>
+    </w:p>
+    <w:p>
+      <w:pPr>
+        <w:pStyle w:val="Sinespaciado"/>
+        <w:spacing w:line="360" w:lineRule="auto"/>
+        <w:jc w:val="both"/>
+        <w:rPr>
+          <w:rFonts w:ascii="Arial" w:hAnsi="Arial" w:cs="Arial"/>
+          <w:b/>
+          <w:bCs/>
+          <w:lang w:eastAsia="es-EC"/>
+        </w:rPr>
+      </w:pPr>
+    </w:p>
+    <w:p>
+      <w:pPr>
+        <w:pStyle w:val="Sinespaciado"/>
+        <w:spacing w:line="360" w:lineRule="auto"/>
+        <w:jc w:val="both"/>
+        <w:rPr>
+          <w:rFonts w:ascii="Arial" w:hAnsi="Arial" w:cs="Arial"/>
+          <w:b/>
+          <w:bCs/>
+          <w:lang w:eastAsia="es-EC"/>
+        </w:rPr>
+      </w:pPr>
+    </w:p>
+    <w:p>
+      <w:pPr>
+        <w:pStyle w:val="Sinespaciado"/>
+        <w:spacing w:line="360" w:lineRule="auto"/>
+        <w:jc w:val="both"/>
+        <w:rPr>
+          <w:rFonts w:ascii="Arial" w:hAnsi="Arial" w:cs="Arial"/>
+          <w:b/>
+          <w:bCs/>
+          <w:lang w:eastAsia="es-EC"/>
+        </w:rPr>
+      </w:pPr>
+    </w:p>
+    <w:p>
+      <w:pPr>
+        <w:pStyle w:val="Sinespaciado"/>
+        <w:spacing w:line="360" w:lineRule="auto"/>
+        <w:jc w:val="both"/>
+        <w:rPr>
+          <w:rFonts w:ascii="Arial" w:hAnsi="Arial" w:cs="Arial"/>
+          <w:b/>
+          <w:bCs/>
+          <w:lang w:eastAsia="es-EC"/>
+        </w:rPr>
+      </w:pPr>
+    </w:p>
+    <w:p>
+      <w:pPr>
+        <w:pStyle w:val="Sinespaciado"/>
+        <w:spacing w:line="360" w:lineRule="auto"/>
+        <w:jc w:val="both"/>
+        <w:rPr>
+          <w:rFonts w:ascii="Arial" w:hAnsi="Arial" w:cs="Arial"/>
+          <w:b/>
+          <w:bCs/>
+          <w:lang w:eastAsia="es-EC"/>
+        </w:rPr>
+      </w:pPr>
+    </w:p>
+    <w:p>
+      <w:pPr>
+        <w:pStyle w:val="Sinespaciado"/>
+        <w:spacing w:line="360" w:lineRule="auto"/>
+        <w:jc w:val="both"/>
+        <w:rPr>
+          <w:rFonts w:ascii="Arial" w:hAnsi="Arial" w:cs="Arial"/>
+          <w:b/>
+          <w:bCs/>
+          <w:lang w:eastAsia="es-EC"/>
+        </w:rPr>
+      </w:pPr>
+    </w:p>
+    <w:p>
+      <w:pPr>
+        <w:pStyle w:val="Sinespaciado"/>
+        <w:spacing w:line="360" w:lineRule="auto"/>
+        <w:jc w:val="both"/>
+        <w:rPr>
+          <w:rFonts w:ascii="Arial" w:hAnsi="Arial" w:cs="Arial"/>
+          <w:b/>
+          <w:bCs/>
+          <w:lang w:eastAsia="es-EC"/>
+        </w:rPr>
+      </w:pPr>
+      <w:r>
+        <w:rPr>
+          <w:rFonts w:ascii="Arial" w:hAnsi="Arial" w:cs="Arial"/>
+          <w:b/>
+          <w:bCs/>
+          <w:noProof/>
+          <w:lang w:eastAsia="es-EC"/>
+        </w:rPr>
+        <w:lastRenderedPageBreak/>
+        <w:drawing>
+          <wp:anchor distT="0" distB="0" distL="114300" distR="114300" simplePos="0" relativeHeight="251698176" behindDoc="0" locked="0" layoutInCell="1" allowOverlap="1" wp14:anchorId="58316BC4" wp14:editId="6BD1A196">
+            <wp:simplePos x="0" y="0"/>
+            <wp:positionH relativeFrom="column">
+              <wp:posOffset>-822960</wp:posOffset>
+            </wp:positionH>
+            <wp:positionV relativeFrom="paragraph">
+              <wp:posOffset>-203200</wp:posOffset>
+            </wp:positionV>
+            <wp:extent cx="1447800" cy="1343025"/>
+            <wp:effectExtent l="0" t="0" r="0" b="9525"/>
+            <wp:wrapNone/>
+            <wp:docPr id="35" name="Imagen 35"/>
+            <wp:cNvGraphicFramePr>
+              <a:graphicFrameLocks xmlns:a="http://schemas.openxmlformats.org/drawingml/2006/main" noChangeAspect="1"/>
+            </wp:cNvGraphicFramePr>
+            <a:graphic xmlns:a="http://schemas.openxmlformats.org/drawingml/2006/main">
+              <a:graphicData uri="http://schemas.openxmlformats.org/drawingml/2006/picture">
+                <pic:pic xmlns:pic="http://schemas.openxmlformats.org/drawingml/2006/picture">
+                  <pic:nvPicPr>
+                    <pic:cNvPr id="0" name="Picture 2"/>
+                    <pic:cNvPicPr>
+                      <a:picLocks noChangeAspect="1" noChangeArrowheads="1"/>
+                    </pic:cNvPicPr>
+                  </pic:nvPicPr>
+                  <pic:blipFill rotWithShape="1">
+                    <a:blip r:embed="rId32">
+                      <a:extLst>
+                        <a:ext uri="{28A0092B-C50C-407E-A947-70E740481C1C}">
+                          <a14:useLocalDpi xmlns:a14="http://schemas.microsoft.com/office/drawing/2010/main" val="0"/>
+                        </a:ext>
+                      </a:extLst>
+                    </a:blip>
+                    <a:srcRect l="24125" t="-1" r="8949" b="705"/>
+                    <a:stretch/>
+                  </pic:blipFill>
+                  <pic:spPr bwMode="auto">
+                    <a:xfrm>
+                      <a:off x="0" y="0"/>
+                      <a:ext cx="1447800" cy="1343025"/>
                     </a:xfrm>
                     <a:prstGeom prst="rect">
                       <a:avLst/>
@@ -8796,26 +9486,18 @@
           <w:lang w:eastAsia="es-EC"/>
         </w:rPr>
         <w:drawing>
-          <wp:anchor distT="0" distB="0" distL="114300" distR="114300" simplePos="0" relativeHeight="251689984" behindDoc="1" locked="0" layoutInCell="1" allowOverlap="1" wp14:anchorId="715CB3B7" wp14:editId="08E4DA8B">
+          <wp:anchor distT="0" distB="0" distL="114300" distR="114300" simplePos="0" relativeHeight="251700224" behindDoc="0" locked="0" layoutInCell="1" allowOverlap="1" wp14:anchorId="0437ACF2" wp14:editId="100B6C71">
             <wp:simplePos x="0" y="0"/>
-            <wp:positionH relativeFrom="column">
-              <wp:posOffset>1577340</wp:posOffset>
+            <wp:positionH relativeFrom="margin">
+              <wp:posOffset>3406140</wp:posOffset>
             </wp:positionH>
             <wp:positionV relativeFrom="paragraph">
-              <wp:posOffset>2527935</wp:posOffset>
+              <wp:posOffset>-136525</wp:posOffset>
             </wp:positionV>
-            <wp:extent cx="2371725" cy="1143000"/>
-            <wp:effectExtent l="0" t="0" r="9525" b="0"/>
-            <wp:wrapTight wrapText="bothSides">
-              <wp:wrapPolygon edited="0">
-                <wp:start x="0" y="0"/>
-                <wp:lineTo x="0" y="21240"/>
-                <wp:lineTo x="21513" y="21240"/>
-                <wp:lineTo x="21513" y="0"/>
-                <wp:lineTo x="0" y="0"/>
-              </wp:wrapPolygon>
-            </wp:wrapTight>
-            <wp:docPr id="27" name="Imagen 27"/>
+            <wp:extent cx="2771775" cy="1323975"/>
+            <wp:effectExtent l="0" t="0" r="9525" b="9525"/>
+            <wp:wrapNone/>
+            <wp:docPr id="37" name="Imagen 37"/>
             <wp:cNvGraphicFramePr>
               <a:graphicFrameLocks xmlns:a="http://schemas.openxmlformats.org/drawingml/2006/main" noChangeAspect="1"/>
             </wp:cNvGraphicFramePr>
@@ -8823,26 +9505,97 @@
               <a:graphicData uri="http://schemas.openxmlformats.org/drawingml/2006/picture">
                 <pic:pic xmlns:pic="http://schemas.openxmlformats.org/drawingml/2006/picture">
                   <pic:nvPicPr>
-                    <pic:cNvPr id="0" name="Picture 11"/>
+                    <pic:cNvPr id="0" name="Picture 4"/>
                     <pic:cNvPicPr>
                       <a:picLocks noChangeAspect="1" noChangeArrowheads="1"/>
                     </pic:cNvPicPr>
                   </pic:nvPicPr>
-                  <pic:blipFill rotWithShape="1">
-                    <a:blip r:embed="rId28" cstate="print">
+                  <pic:blipFill>
+                    <a:blip r:embed="rId33" cstate="print">
                       <a:extLst>
                         <a:ext uri="{28A0092B-C50C-407E-A947-70E740481C1C}">
                           <a14:useLocalDpi xmlns:a14="http://schemas.microsoft.com/office/drawing/2010/main" val="0"/>
                         </a:ext>
                       </a:extLst>
                     </a:blip>
-                    <a:srcRect l="25752" t="14315" r="29092" b="23648"/>
+                    <a:srcRect/>
+                    <a:stretch>
+                      <a:fillRect/>
+                    </a:stretch>
+                  </pic:blipFill>
+                  <pic:spPr bwMode="auto">
+                    <a:xfrm>
+                      <a:off x="0" y="0"/>
+                      <a:ext cx="2771775" cy="1323975"/>
+                    </a:xfrm>
+                    <a:prstGeom prst="rect">
+                      <a:avLst/>
+                    </a:prstGeom>
+                    <a:noFill/>
+                    <a:ln>
+                      <a:noFill/>
+                    </a:ln>
+                  </pic:spPr>
+                </pic:pic>
+              </a:graphicData>
+            </a:graphic>
+            <wp14:sizeRelH relativeFrom="margin">
+              <wp14:pctWidth>0</wp14:pctWidth>
+            </wp14:sizeRelH>
+            <wp14:sizeRelV relativeFrom="margin">
+              <wp14:pctHeight>0</wp14:pctHeight>
+            </wp14:sizeRelV>
+          </wp:anchor>
+        </w:drawing>
+      </w:r>
+      <w:r>
+        <w:rPr>
+          <w:rFonts w:ascii="Arial" w:hAnsi="Arial" w:cs="Arial"/>
+          <w:b/>
+          <w:bCs/>
+          <w:noProof/>
+          <w:lang w:eastAsia="es-EC"/>
+        </w:rPr>
+        <w:drawing>
+          <wp:anchor distT="0" distB="0" distL="114300" distR="114300" simplePos="0" relativeHeight="251699200" behindDoc="0" locked="0" layoutInCell="1" allowOverlap="1" wp14:anchorId="47B61F5B" wp14:editId="7E22FF6B">
+            <wp:simplePos x="0" y="0"/>
+            <wp:positionH relativeFrom="margin">
+              <wp:posOffset>901065</wp:posOffset>
+            </wp:positionH>
+            <wp:positionV relativeFrom="paragraph">
+              <wp:posOffset>-117475</wp:posOffset>
+            </wp:positionV>
+            <wp:extent cx="2247900" cy="1333500"/>
+            <wp:effectExtent l="0" t="0" r="0" b="0"/>
+            <wp:wrapNone/>
+            <wp:docPr id="36" name="Imagen 36"/>
+            <wp:cNvGraphicFramePr>
+              <a:graphicFrameLocks xmlns:a="http://schemas.openxmlformats.org/drawingml/2006/main" noChangeAspect="1"/>
+            </wp:cNvGraphicFramePr>
+            <a:graphic xmlns:a="http://schemas.openxmlformats.org/drawingml/2006/main">
+              <a:graphicData uri="http://schemas.openxmlformats.org/drawingml/2006/picture">
+                <pic:pic xmlns:pic="http://schemas.openxmlformats.org/drawingml/2006/picture">
+                  <pic:nvPicPr>
+                    <pic:cNvPr id="0" name="Picture 3"/>
+                    <pic:cNvPicPr>
+                      <a:picLocks noChangeAspect="1" noChangeArrowheads="1"/>
+                    </pic:cNvPicPr>
+                  </pic:nvPicPr>
+                  <pic:blipFill rotWithShape="1">
+                    <a:blip r:embed="rId34" cstate="print">
+                      <a:extLst>
+                        <a:ext uri="{28A0092B-C50C-407E-A947-70E740481C1C}">
+                          <a14:useLocalDpi xmlns:a14="http://schemas.microsoft.com/office/drawing/2010/main" val="0"/>
+                        </a:ext>
+                      </a:extLst>
+                    </a:blip>
+                    <a:srcRect l="10545" r="10152"/>
                     <a:stretch/>
                   </pic:blipFill>
                   <pic:spPr bwMode="auto">
                     <a:xfrm>
                       <a:off x="0" y="0"/>
-                      <a:ext cx="2371725" cy="1143000"/>
+                      <a:ext cx="2247900" cy="1333500"/>
                     </a:xfrm>
                     <a:prstGeom prst="rect">
                       <a:avLst/>
@@ -8869,6 +9622,70 @@
           </wp:anchor>
         </w:drawing>
       </w:r>
+    </w:p>
+    <w:p>
+      <w:pPr>
+        <w:pStyle w:val="Sinespaciado"/>
+        <w:spacing w:line="360" w:lineRule="auto"/>
+        <w:jc w:val="both"/>
+        <w:rPr>
+          <w:rFonts w:ascii="Arial" w:hAnsi="Arial" w:cs="Arial"/>
+          <w:b/>
+          <w:bCs/>
+          <w:lang w:eastAsia="es-EC"/>
+        </w:rPr>
+      </w:pPr>
+    </w:p>
+    <w:p>
+      <w:pPr>
+        <w:pStyle w:val="Sinespaciado"/>
+        <w:spacing w:line="360" w:lineRule="auto"/>
+        <w:jc w:val="both"/>
+        <w:rPr>
+          <w:rFonts w:ascii="Arial" w:hAnsi="Arial" w:cs="Arial"/>
+          <w:b/>
+          <w:bCs/>
+          <w:lang w:eastAsia="es-EC"/>
+        </w:rPr>
+      </w:pPr>
+    </w:p>
+    <w:p>
+      <w:pPr>
+        <w:pStyle w:val="Sinespaciado"/>
+        <w:tabs>
+          <w:tab w:val="left" w:pos="6045"/>
+        </w:tabs>
+        <w:spacing w:line="360" w:lineRule="auto"/>
+        <w:jc w:val="both"/>
+        <w:rPr>
+          <w:rFonts w:ascii="Arial" w:hAnsi="Arial" w:cs="Arial"/>
+          <w:b/>
+          <w:bCs/>
+          <w:lang w:eastAsia="es-EC"/>
+        </w:rPr>
+      </w:pPr>
+      <w:r>
+        <w:rPr>
+          <w:rFonts w:ascii="Arial" w:hAnsi="Arial" w:cs="Arial"/>
+          <w:b/>
+          <w:bCs/>
+          <w:lang w:eastAsia="es-EC"/>
+        </w:rPr>
+        <w:tab/>
+      </w:r>
+    </w:p>
+    <w:p>
+      <w:pPr>
+        <w:pStyle w:val="Sinespaciado"/>
+        <w:spacing w:line="360" w:lineRule="auto"/>
+        <w:jc w:val="both"/>
+        <w:rPr>
+          <w:rFonts w:ascii="Arial" w:hAnsi="Arial" w:cs="Arial"/>
+          <w:b/>
+          <w:bCs/>
+          <w:lang w:eastAsia="es-EC"/>
+        </w:rPr>
+      </w:pPr>
       <w:r>
         <w:rPr>
           <w:rFonts w:ascii="Arial" w:hAnsi="Arial" w:cs="Arial"/>
@@ -8878,26 +9695,18 @@
           <w:lang w:eastAsia="es-EC"/>
         </w:rPr>
         <w:drawing>
-          <wp:anchor distT="0" distB="0" distL="114300" distR="114300" simplePos="0" relativeHeight="251686912" behindDoc="1" locked="0" layoutInCell="1" allowOverlap="1" wp14:anchorId="4E256F88" wp14:editId="4E38F468">
+          <wp:anchor distT="0" distB="0" distL="114300" distR="114300" simplePos="0" relativeHeight="251701248" behindDoc="0" locked="0" layoutInCell="1" allowOverlap="1" wp14:anchorId="38B93106" wp14:editId="2A66013C">
             <wp:simplePos x="0" y="0"/>
             <wp:positionH relativeFrom="column">
-              <wp:posOffset>1567815</wp:posOffset>
+              <wp:posOffset>-832485</wp:posOffset>
             </wp:positionH>
             <wp:positionV relativeFrom="paragraph">
-              <wp:posOffset>1232535</wp:posOffset>
+              <wp:posOffset>319405</wp:posOffset>
             </wp:positionV>
-            <wp:extent cx="2457450" cy="1200150"/>
+            <wp:extent cx="2419350" cy="1466850"/>
             <wp:effectExtent l="0" t="0" r="0" b="0"/>
-            <wp:wrapTight wrapText="bothSides">
-              <wp:wrapPolygon edited="0">
-                <wp:start x="0" y="0"/>
-                <wp:lineTo x="0" y="21257"/>
-                <wp:lineTo x="21433" y="21257"/>
-                <wp:lineTo x="21433" y="0"/>
-                <wp:lineTo x="0" y="0"/>
-              </wp:wrapPolygon>
-            </wp:wrapTight>
-            <wp:docPr id="24" name="Imagen 24"/>
+            <wp:wrapNone/>
+            <wp:docPr id="38" name="Imagen 38"/>
             <wp:cNvGraphicFramePr>
               <a:graphicFrameLocks xmlns:a="http://schemas.openxmlformats.org/drawingml/2006/main" noChangeAspect="1"/>
             </wp:cNvGraphicFramePr>
@@ -8905,95 +9714,13 @@
               <a:graphicData uri="http://schemas.openxmlformats.org/drawingml/2006/picture">
                 <pic:pic xmlns:pic="http://schemas.openxmlformats.org/drawingml/2006/picture">
                   <pic:nvPicPr>
-                    <pic:cNvPr id="0" name="Picture 8"/>
-                    <pic:cNvPicPr>
-                      <a:picLocks noChangeAspect="1" noChangeArrowheads="1"/>
-                    </pic:cNvPicPr>
-                  </pic:nvPicPr>
-                  <pic:blipFill rotWithShape="1">
-                    <a:blip r:embed="rId29" cstate="print">
-                      <a:extLst>
-                        <a:ext uri="{28A0092B-C50C-407E-A947-70E740481C1C}">
-                          <a14:useLocalDpi xmlns:a14="http://schemas.microsoft.com/office/drawing/2010/main" val="0"/>
-                        </a:ext>
-                      </a:extLst>
-                    </a:blip>
-                    <a:srcRect l="13405" t="2492" r="9866" b="9034"/>
-                    <a:stretch/>
-                  </pic:blipFill>
-                  <pic:spPr bwMode="auto">
-                    <a:xfrm>
-                      <a:off x="0" y="0"/>
-                      <a:ext cx="2457450" cy="1200150"/>
-                    </a:xfrm>
-                    <a:prstGeom prst="rect">
-                      <a:avLst/>
-                    </a:prstGeom>
-                    <a:noFill/>
-                    <a:ln>
-                      <a:noFill/>
-                    </a:ln>
-                    <a:extLst>
-                      <a:ext uri="{53640926-AAD7-44D8-BBD7-CCE9431645EC}">
-                        <a14:shadowObscured xmlns:a14="http://schemas.microsoft.com/office/drawing/2010/main"/>
-                      </a:ext>
-                    </a:extLst>
-                  </pic:spPr>
-                </pic:pic>
-              </a:graphicData>
-            </a:graphic>
-            <wp14:sizeRelH relativeFrom="margin">
-              <wp14:pctWidth>0</wp14:pctWidth>
-            </wp14:sizeRelH>
-            <wp14:sizeRelV relativeFrom="margin">
-              <wp14:pctHeight>0</wp14:pctHeight>
-            </wp14:sizeRelV>
-          </wp:anchor>
-        </w:drawing>
-      </w:r>
-      <w:r>
-        <w:rPr>
-          <w:rFonts w:ascii="Arial" w:hAnsi="Arial" w:cs="Arial"/>
-          <w:b/>
-          <w:bCs/>
-          <w:noProof/>
-          <w:lang w:eastAsia="es-EC"/>
-        </w:rPr>
-        <w:drawing>
-          <wp:anchor distT="0" distB="0" distL="114300" distR="114300" simplePos="0" relativeHeight="251685888" behindDoc="1" locked="0" layoutInCell="1" allowOverlap="1" wp14:anchorId="318E382B" wp14:editId="76DC4819">
-            <wp:simplePos x="0" y="0"/>
-            <wp:positionH relativeFrom="margin">
-              <wp:posOffset>-994410</wp:posOffset>
-            </wp:positionH>
-            <wp:positionV relativeFrom="paragraph">
-              <wp:posOffset>1213485</wp:posOffset>
-            </wp:positionV>
-            <wp:extent cx="2486025" cy="1238250"/>
-            <wp:effectExtent l="0" t="0" r="9525" b="0"/>
-            <wp:wrapTight wrapText="bothSides">
-              <wp:wrapPolygon edited="0">
-                <wp:start x="0" y="0"/>
-                <wp:lineTo x="0" y="21268"/>
-                <wp:lineTo x="21517" y="21268"/>
-                <wp:lineTo x="21517" y="0"/>
-                <wp:lineTo x="0" y="0"/>
-              </wp:wrapPolygon>
-            </wp:wrapTight>
-            <wp:docPr id="23" name="Imagen 23"/>
-            <wp:cNvGraphicFramePr>
-              <a:graphicFrameLocks xmlns:a="http://schemas.openxmlformats.org/drawingml/2006/main" noChangeAspect="1"/>
-            </wp:cNvGraphicFramePr>
-            <a:graphic xmlns:a="http://schemas.openxmlformats.org/drawingml/2006/main">
-              <a:graphicData uri="http://schemas.openxmlformats.org/drawingml/2006/picture">
-                <pic:pic xmlns:pic="http://schemas.openxmlformats.org/drawingml/2006/picture">
-                  <pic:nvPicPr>
-                    <pic:cNvPr id="0" name="Picture 7"/>
+                    <pic:cNvPr id="0" name="Picture 6"/>
                     <pic:cNvPicPr>
                       <a:picLocks noChangeAspect="1" noChangeArrowheads="1"/>
                     </pic:cNvPicPr>
                   </pic:nvPicPr>
                   <pic:blipFill>
-                    <a:blip r:embed="rId30" cstate="print">
+                    <a:blip r:embed="rId35" cstate="print">
                       <a:extLst>
                         <a:ext uri="{28A0092B-C50C-407E-A947-70E740481C1C}">
                           <a14:useLocalDpi xmlns:a14="http://schemas.microsoft.com/office/drawing/2010/main" val="0"/>
@@ -9008,7 +9735,7 @@
                   <pic:spPr bwMode="auto">
                     <a:xfrm>
                       <a:off x="0" y="0"/>
-                      <a:ext cx="2486025" cy="1238250"/>
+                      <a:ext cx="2419350" cy="1466850"/>
                     </a:xfrm>
                     <a:prstGeom prst="rect">
                       <a:avLst/>
@@ -9043,6 +9770,174 @@
           <w:lang w:eastAsia="es-EC"/>
         </w:rPr>
       </w:pPr>
+      <w:r>
+        <w:rPr>
+          <w:rFonts w:ascii="Arial" w:hAnsi="Arial" w:cs="Arial"/>
+          <w:b/>
+          <w:bCs/>
+          <w:noProof/>
+          <w:lang w:eastAsia="es-EC"/>
+        </w:rPr>
+        <w:drawing>
+          <wp:anchor distT="0" distB="0" distL="114300" distR="114300" simplePos="0" relativeHeight="251703296" behindDoc="0" locked="0" layoutInCell="1" allowOverlap="1" wp14:anchorId="389FC984" wp14:editId="4AB2BE3F">
+            <wp:simplePos x="0" y="0"/>
+            <wp:positionH relativeFrom="margin">
+              <wp:posOffset>4082415</wp:posOffset>
+            </wp:positionH>
+            <wp:positionV relativeFrom="paragraph">
+              <wp:posOffset>106680</wp:posOffset>
+            </wp:positionV>
+            <wp:extent cx="2057400" cy="1367071"/>
+            <wp:effectExtent l="0" t="0" r="0" b="5080"/>
+            <wp:wrapNone/>
+            <wp:docPr id="40" name="Imagen 40"/>
+            <wp:cNvGraphicFramePr>
+              <a:graphicFrameLocks xmlns:a="http://schemas.openxmlformats.org/drawingml/2006/main" noChangeAspect="1"/>
+            </wp:cNvGraphicFramePr>
+            <a:graphic xmlns:a="http://schemas.openxmlformats.org/drawingml/2006/main">
+              <a:graphicData uri="http://schemas.openxmlformats.org/drawingml/2006/picture">
+                <pic:pic xmlns:pic="http://schemas.openxmlformats.org/drawingml/2006/picture">
+                  <pic:nvPicPr>
+                    <pic:cNvPr id="0" name="Picture 8"/>
+                    <pic:cNvPicPr>
+                      <a:picLocks noChangeAspect="1" noChangeArrowheads="1"/>
+                    </pic:cNvPicPr>
+                  </pic:nvPicPr>
+                  <pic:blipFill>
+                    <a:blip r:embed="rId36" cstate="print">
+                      <a:extLst>
+                        <a:ext uri="{28A0092B-C50C-407E-A947-70E740481C1C}">
+                          <a14:useLocalDpi xmlns:a14="http://schemas.microsoft.com/office/drawing/2010/main" val="0"/>
+                        </a:ext>
+                      </a:extLst>
+                    </a:blip>
+                    <a:srcRect/>
+                    <a:stretch>
+                      <a:fillRect/>
+                    </a:stretch>
+                  </pic:blipFill>
+                  <pic:spPr bwMode="auto">
+                    <a:xfrm>
+                      <a:off x="0" y="0"/>
+                      <a:ext cx="2078153" cy="1380861"/>
+                    </a:xfrm>
+                    <a:prstGeom prst="rect">
+                      <a:avLst/>
+                    </a:prstGeom>
+                    <a:noFill/>
+                    <a:ln>
+                      <a:noFill/>
+                    </a:ln>
+                  </pic:spPr>
+                </pic:pic>
+              </a:graphicData>
+            </a:graphic>
+            <wp14:sizeRelH relativeFrom="margin">
+              <wp14:pctWidth>0</wp14:pctWidth>
+            </wp14:sizeRelH>
+            <wp14:sizeRelV relativeFrom="margin">
+              <wp14:pctHeight>0</wp14:pctHeight>
+            </wp14:sizeRelV>
+          </wp:anchor>
+        </w:drawing>
+      </w:r>
+      <w:r>
+        <w:rPr>
+          <w:rFonts w:ascii="Arial" w:hAnsi="Arial" w:cs="Arial"/>
+          <w:b/>
+          <w:bCs/>
+          <w:noProof/>
+          <w:lang w:eastAsia="es-EC"/>
+        </w:rPr>
+        <w:drawing>
+          <wp:anchor distT="0" distB="0" distL="114300" distR="114300" simplePos="0" relativeHeight="251702272" behindDoc="0" locked="0" layoutInCell="1" allowOverlap="1" wp14:anchorId="5516003E" wp14:editId="5356D5DC">
+            <wp:simplePos x="0" y="0"/>
+            <wp:positionH relativeFrom="margin">
+              <wp:posOffset>1672590</wp:posOffset>
+            </wp:positionH>
+            <wp:positionV relativeFrom="paragraph">
+              <wp:posOffset>30480</wp:posOffset>
+            </wp:positionV>
+            <wp:extent cx="2332990" cy="1504950"/>
+            <wp:effectExtent l="0" t="0" r="0" b="0"/>
+            <wp:wrapNone/>
+            <wp:docPr id="39" name="Imagen 39"/>
+            <wp:cNvGraphicFramePr>
+              <a:graphicFrameLocks xmlns:a="http://schemas.openxmlformats.org/drawingml/2006/main" noChangeAspect="1"/>
+            </wp:cNvGraphicFramePr>
+            <a:graphic xmlns:a="http://schemas.openxmlformats.org/drawingml/2006/main">
+              <a:graphicData uri="http://schemas.openxmlformats.org/drawingml/2006/picture">
+                <pic:pic xmlns:pic="http://schemas.openxmlformats.org/drawingml/2006/picture">
+                  <pic:nvPicPr>
+                    <pic:cNvPr id="0" name="Picture 7"/>
+                    <pic:cNvPicPr>
+                      <a:picLocks noChangeAspect="1" noChangeArrowheads="1"/>
+                    </pic:cNvPicPr>
+                  </pic:nvPicPr>
+                  <pic:blipFill>
+                    <a:blip r:embed="rId37" cstate="print">
+                      <a:extLst>
+                        <a:ext uri="{28A0092B-C50C-407E-A947-70E740481C1C}">
+                          <a14:useLocalDpi xmlns:a14="http://schemas.microsoft.com/office/drawing/2010/main" val="0"/>
+                        </a:ext>
+                      </a:extLst>
+                    </a:blip>
+                    <a:srcRect/>
+                    <a:stretch>
+                      <a:fillRect/>
+                    </a:stretch>
+                  </pic:blipFill>
+                  <pic:spPr bwMode="auto">
+                    <a:xfrm>
+                      <a:off x="0" y="0"/>
+                      <a:ext cx="2332990" cy="1504950"/>
+                    </a:xfrm>
+                    <a:prstGeom prst="rect">
+                      <a:avLst/>
+                    </a:prstGeom>
+                    <a:noFill/>
+                    <a:ln>
+                      <a:noFill/>
+                    </a:ln>
+                  </pic:spPr>
+                </pic:pic>
+              </a:graphicData>
+            </a:graphic>
+            <wp14:sizeRelH relativeFrom="margin">
+              <wp14:pctWidth>0</wp14:pctWidth>
+            </wp14:sizeRelH>
+            <wp14:sizeRelV relativeFrom="margin">
+              <wp14:pctHeight>0</wp14:pctHeight>
+            </wp14:sizeRelV>
+          </wp:anchor>
+        </w:drawing>
+      </w:r>
+    </w:p>
+    <w:p>
+      <w:pPr>
+        <w:pStyle w:val="Sinespaciado"/>
+        <w:spacing w:line="360" w:lineRule="auto"/>
+        <w:jc w:val="both"/>
+        <w:rPr>
+          <w:rFonts w:ascii="Arial" w:hAnsi="Arial" w:cs="Arial"/>
+          <w:b/>
+          <w:bCs/>
+          <w:lang w:eastAsia="es-EC"/>
+        </w:rPr>
+      </w:pPr>
+    </w:p>
+    <w:p>
+      <w:pPr>
+        <w:pStyle w:val="Sinespaciado"/>
+        <w:spacing w:line="360" w:lineRule="auto"/>
+        <w:jc w:val="both"/>
+        <w:rPr>
+          <w:rFonts w:ascii="Arial" w:hAnsi="Arial" w:cs="Arial"/>
+          <w:b/>
+          <w:bCs/>
+          <w:lang w:eastAsia="es-EC"/>
+        </w:rPr>
+      </w:pPr>
     </w:p>
     <w:p>
       <w:pPr>
@@ -9318,7 +10213,7 @@
         </w:rPr>
         <w:t xml:space="preserve"> 2.5.1. </w:t>
       </w:r>
-      <w:hyperlink r:id="rId31" w:history="1">
+      <w:hyperlink r:id="rId38" w:history="1">
         <w:r>
           <w:rPr>
             <w:rStyle w:val="Hipervnculo"/>
@@ -9422,7 +10317,7 @@
         </w:rPr>
         <w:t xml:space="preserve">. </w:t>
       </w:r>
-      <w:hyperlink r:id="rId32" w:history="1">
+      <w:hyperlink r:id="rId39" w:history="1">
         <w:r>
           <w:rPr>
             <w:rStyle w:val="Hipervnculo"/>
@@ -9550,7 +10445,7 @@
         </w:rPr>
         <w:t xml:space="preserve">. </w:t>
       </w:r>
-      <w:hyperlink r:id="rId33" w:history="1">
+      <w:hyperlink r:id="rId40" w:history="1">
         <w:r>
           <w:rPr>
             <w:rStyle w:val="Hipervnculo"/>
@@ -9702,7 +10597,7 @@
         </w:rPr>
         <w:t xml:space="preserve">. </w:t>
       </w:r>
-      <w:hyperlink r:id="rId34" w:history="1">
+      <w:hyperlink r:id="rId41" w:history="1">
         <w:r>
           <w:rPr>
             <w:rStyle w:val="Hipervnculo"/>
@@ -9843,7 +10738,7 @@
         </w:rPr>
         <w:t xml:space="preserve">. </w:t>
       </w:r>
-      <w:hyperlink r:id="rId35" w:history="1">
+      <w:hyperlink r:id="rId42" w:history="1">
         <w:r>
           <w:rPr>
             <w:rStyle w:val="Hipervnculo"/>
@@ -9984,7 +10879,7 @@
         </w:rPr>
         <w:t xml:space="preserve">. </w:t>
       </w:r>
-      <w:hyperlink r:id="rId36" w:history="1">
+      <w:hyperlink r:id="rId43" w:history="1">
         <w:r>
           <w:rPr>
             <w:rStyle w:val="Hipervnculo"/>
@@ -10125,7 +11020,7 @@
         </w:rPr>
         <w:t xml:space="preserve">. </w:t>
       </w:r>
-      <w:hyperlink r:id="rId37" w:history="1">
+      <w:hyperlink r:id="rId44" w:history="1">
         <w:r>
           <w:rPr>
             <w:rStyle w:val="Hipervnculo"/>
@@ -10242,7 +11137,7 @@
         </w:rPr>
         <w:t xml:space="preserve">. </w:t>
       </w:r>
-      <w:hyperlink r:id="rId38" w:history="1">
+      <w:hyperlink r:id="rId45" w:history="1">
         <w:r>
           <w:rPr>
             <w:rStyle w:val="Hipervnculo"/>
@@ -10360,7 +11255,7 @@
         </w:rPr>
         <w:t xml:space="preserve">. </w:t>
       </w:r>
-      <w:hyperlink r:id="rId39" w:history="1">
+      <w:hyperlink r:id="rId46" w:history="1">
         <w:r>
           <w:rPr>
             <w:rStyle w:val="Hipervnculo"/>
@@ -10432,7 +11327,7 @@
       </w:r>
     </w:p>
     <w:sectPr>
-      <w:headerReference w:type="first" r:id="rId40"/>
+      <w:headerReference w:type="first" r:id="rId47"/>
       <w:pgSz w:w="11906" w:h="16838"/>
       <w:pgMar w:top="1417" w:right="1701" w:bottom="1417" w:left="1701" w:header="708" w:footer="708" w:gutter="0"/>
       <w:pgNumType w:start="1"/>
@@ -11308,7 +12203,7 @@
         <v:path o:extrusionok="f" gradientshapeok="t" o:connecttype="rect"/>
         <o:lock v:ext="edit" aspectratio="t"/>
       </v:shapetype>
-      <v:shape id="_x0000_i1173" type="#_x0000_t75" style="width:11.25pt;height:11.25pt" o:bullet="t">
+      <v:shape id="_x0000_i1050" type="#_x0000_t75" style="width:11.25pt;height:11.25pt" o:bullet="t">
         <v:imagedata r:id="rId1" o:title="mso3E28"/>
       </v:shape>
     </w:pict>
@@ -13977,6 +14872,7 @@
     <w:lsdException w:name="HTML Sample" w:semiHidden="1" w:unhideWhenUsed="1"/>
     <w:lsdException w:name="HTML Typewriter" w:semiHidden="1" w:unhideWhenUsed="1"/>
     <w:lsdException w:name="HTML Variable" w:semiHidden="1" w:unhideWhenUsed="1"/>
+    <w:lsdException w:name="Normal Table" w:semiHidden="1" w:unhideWhenUsed="1"/>
     <w:lsdException w:name="annotation subject" w:semiHidden="1" w:unhideWhenUsed="1"/>
     <w:lsdException w:name="No List" w:semiHidden="1" w:unhideWhenUsed="1"/>
     <w:lsdException w:name="Outline List 1" w:semiHidden="1" w:unhideWhenUsed="1"/>
@@ -14023,8 +14919,10 @@
     <w:lsdException w:name="Table Subtle 2" w:semiHidden="1" w:unhideWhenUsed="1"/>
     <w:lsdException w:name="Table Web 1" w:semiHidden="1" w:unhideWhenUsed="1"/>
     <w:lsdException w:name="Table Web 2" w:semiHidden="1" w:unhideWhenUsed="1"/>
+    <w:lsdException w:name="Table Web 3" w:semiHidden="1" w:unhideWhenUsed="1"/>
     <w:lsdException w:name="Balloon Text" w:semiHidden="1" w:unhideWhenUsed="1"/>
     <w:lsdException w:name="Table Grid" w:uiPriority="39"/>
+    <w:lsdException w:name="Table Theme" w:semiHidden="1" w:unhideWhenUsed="1"/>
     <w:lsdException w:name="Placeholder Text" w:semiHidden="1"/>
     <w:lsdException w:name="No Spacing" w:uiPriority="1" w:qFormat="1"/>
     <w:lsdException w:name="Light Shading" w:uiPriority="60"/>

</xml_diff>